<commit_message>
vault backup: 2026-04-10 16:58:32
</commit_message>
<xml_diff>
--- a/Investigare/pg/ANTEPRIMA_Fujita_Emi.docx
+++ b/Investigare/pg/ANTEPRIMA_Fujita_Emi.docx
@@ -24,13 +24,14 @@
         <w:tblLook w:firstColumn="1" w:firstRow="1" w:lastColumn="0" w:lastRow="0" w:noHBand="0" w:noVBand="1" w:val="04A0"/>
       </w:tblPr>
       <w:tblGrid>
-        <w:gridCol w:w="5386"/>
-        <w:gridCol w:w="5386"/>
+        <w:gridCol w:w="3591"/>
+        <w:gridCol w:w="3591"/>
+        <w:gridCol w:w="3591"/>
       </w:tblGrid>
       <w:tr>
         <w:tc>
           <w:tcPr>
-            <w:tcW w:w="8505" w:type="dxa"/>
+            <w:tcW w:w="4536" w:type="dxa"/>
             <w:vAlign w:val="center"/>
             <w:tcBorders>
               <w:top w:val="none"/>
@@ -49,7 +50,7 @@
                 <w:b w:val="0"/>
                 <w:i w:val="0"/>
                 <w:color w:val="1A1A2E"/>
-                <w:sz w:val="52"/>
+                <w:sz w:val="48"/>
               </w:rPr>
               <w:t>藤田 恵美</w:t>
             </w:r>
@@ -63,9 +64,113 @@
                 <w:b/>
                 <w:i w:val="0"/>
                 <w:color w:val="1A1A2E"/>
-                <w:sz w:val="28"/>
+                <w:sz w:val="26"/>
               </w:rPr>
               <w:t>FUJITA Emi</w:t>
+            </w:r>
+          </w:p>
+        </w:tc>
+        <w:tc>
+          <w:tcPr>
+            <w:tcW w:w="5103" w:type="dxa"/>
+            <w:vAlign w:val="center"/>
+            <w:tcBorders>
+              <w:top w:val="none"/>
+              <w:left w:val="none"/>
+              <w:right w:val="none"/>
+              <w:bottom w:val="none"/>
+            </w:tcBorders>
+          </w:tcPr>
+          <w:p>
+            <w:pPr>
+              <w:jc w:val="center"/>
+            </w:pPr>
+            <w:r>
+              <w:rPr>
+                <w:b/>
+                <w:i w:val="0"/>
+                <w:color w:val="787878"/>
+                <w:sz w:val="20"/>
+              </w:rPr>
+              <w:t xml:space="preserve">Età </w:t>
+            </w:r>
+            <w:r>
+              <w:rPr>
+                <w:b w:val="0"/>
+                <w:i w:val="0"/>
+                <w:color w:val="1A1A2E"/>
+                <w:sz w:val="20"/>
+              </w:rPr>
+              <w:t>36</w:t>
+            </w:r>
+          </w:p>
+          <w:p>
+            <w:pPr>
+              <w:jc w:val="center"/>
+            </w:pPr>
+            <w:r>
+              <w:rPr>
+                <w:b/>
+                <w:i w:val="0"/>
+                <w:color w:val="787878"/>
+                <w:sz w:val="20"/>
+              </w:rPr>
+              <w:t xml:space="preserve">Ruolo </w:t>
+            </w:r>
+            <w:r>
+              <w:rPr>
+                <w:b w:val="0"/>
+                <w:i w:val="0"/>
+                <w:color w:val="1A1A2E"/>
+                <w:sz w:val="20"/>
+              </w:rPr>
+              <w:t>Profiler / Psicologa Investigativa</w:t>
+            </w:r>
+          </w:p>
+          <w:p>
+            <w:pPr>
+              <w:jc w:val="center"/>
+            </w:pPr>
+            <w:r>
+              <w:rPr>
+                <w:b/>
+                <w:i w:val="0"/>
+                <w:color w:val="787878"/>
+                <w:sz w:val="20"/>
+              </w:rPr>
+              <w:t xml:space="preserve">Grado </w:t>
+            </w:r>
+            <w:r>
+              <w:rPr>
+                <w:b w:val="0"/>
+                <w:i w:val="0"/>
+                <w:color w:val="1A1A2E"/>
+                <w:sz w:val="20"/>
+              </w:rPr>
+              <w:t>Ispettore (Keibu-ho)</w:t>
+            </w:r>
+          </w:p>
+          <w:p>
+            <w:pPr>
+              <w:jc w:val="center"/>
+            </w:pPr>
+            <w:r>
+              <w:rPr>
+                <w:b/>
+                <w:i w:val="0"/>
+                <w:color w:val="787878"/>
+                <w:sz w:val="20"/>
+              </w:rPr>
+              <w:t xml:space="preserve">Servizio </w:t>
+            </w:r>
+            <w:r>
+              <w:rPr>
+                <w:b w:val="0"/>
+                <w:i w:val="0"/>
+                <w:color w:val="1A1A2E"/>
+                <w:sz w:val="20"/>
+              </w:rPr>
+              <w:t>8 anni</w:t>
             </w:r>
           </w:p>
         </w:tc>
@@ -124,111 +229,6 @@
     </w:tbl>
     <w:p>
       <w:pPr>
-        <w:spacing w:before="80" w:after="40"/>
-        <w:jc w:val="center"/>
-      </w:pPr>
-      <w:r>
-        <w:rPr>
-          <w:b/>
-          <w:i w:val="0"/>
-          <w:color w:val="787878"/>
-          <w:sz w:val="20"/>
-        </w:rPr>
-        <w:t xml:space="preserve">Età </w:t>
-      </w:r>
-      <w:r>
-        <w:rPr>
-          <w:b w:val="0"/>
-          <w:i w:val="0"/>
-          <w:color w:val="1A1A2E"/>
-          <w:sz w:val="20"/>
-        </w:rPr>
-        <w:t>36</w:t>
-      </w:r>
-      <w:r>
-        <w:rPr>
-          <w:b w:val="0"/>
-          <w:i w:val="0"/>
-          <w:color w:val="B49650"/>
-          <w:sz w:val="20"/>
-        </w:rPr>
-        <w:t xml:space="preserve">  ·  </w:t>
-      </w:r>
-      <w:r>
-        <w:rPr>
-          <w:b/>
-          <w:i w:val="0"/>
-          <w:color w:val="787878"/>
-          <w:sz w:val="20"/>
-        </w:rPr>
-        <w:t xml:space="preserve">Ruolo </w:t>
-      </w:r>
-      <w:r>
-        <w:rPr>
-          <w:b w:val="0"/>
-          <w:i w:val="0"/>
-          <w:color w:val="1A1A2E"/>
-          <w:sz w:val="20"/>
-        </w:rPr>
-        <w:t>Profiler / Psicologa Investigativa</w:t>
-      </w:r>
-      <w:r>
-        <w:rPr>
-          <w:b w:val="0"/>
-          <w:i w:val="0"/>
-          <w:color w:val="B49650"/>
-          <w:sz w:val="20"/>
-        </w:rPr>
-        <w:t xml:space="preserve">  ·  </w:t>
-      </w:r>
-      <w:r>
-        <w:rPr>
-          <w:b/>
-          <w:i w:val="0"/>
-          <w:color w:val="787878"/>
-          <w:sz w:val="20"/>
-        </w:rPr>
-        <w:t xml:space="preserve">Grado </w:t>
-      </w:r>
-      <w:r>
-        <w:rPr>
-          <w:b w:val="0"/>
-          <w:i w:val="0"/>
-          <w:color w:val="1A1A2E"/>
-          <w:sz w:val="20"/>
-        </w:rPr>
-        <w:t>Ispettore (Keibu-ho)</w:t>
-      </w:r>
-      <w:r>
-        <w:rPr>
-          <w:b w:val="0"/>
-          <w:i w:val="0"/>
-          <w:color w:val="B49650"/>
-          <w:sz w:val="20"/>
-        </w:rPr>
-        <w:t xml:space="preserve">  ·  </w:t>
-      </w:r>
-      <w:r>
-        <w:rPr>
-          <w:b/>
-          <w:i w:val="0"/>
-          <w:color w:val="787878"/>
-          <w:sz w:val="20"/>
-        </w:rPr>
-        <w:t xml:space="preserve">Servizio </w:t>
-      </w:r>
-      <w:r>
-        <w:rPr>
-          <w:b w:val="0"/>
-          <w:i w:val="0"/>
-          <w:color w:val="1A1A2E"/>
-          <w:sz w:val="20"/>
-        </w:rPr>
-        <w:t>8 anni</w:t>
-      </w:r>
-    </w:p>
-    <w:p>
-      <w:pPr>
         <w:spacing w:before="120" w:after="120"/>
         <w:jc w:val="center"/>
       </w:pPr>
@@ -278,18 +278,20 @@
       <w:tblPr>
         <w:tblW w:type="auto" w:w="0"/>
         <w:jc w:val="center"/>
-        <w:tblLayout w:type="autofit"/>
         <w:tblLook w:firstColumn="1" w:firstRow="1" w:lastColumn="0" w:lastRow="0" w:noHBand="0" w:noVBand="1" w:val="04A0"/>
       </w:tblPr>
       <w:tblGrid>
-        <w:gridCol w:w="3591"/>
-        <w:gridCol w:w="3591"/>
-        <w:gridCol w:w="3591"/>
+        <w:gridCol w:w="1795"/>
+        <w:gridCol w:w="1795"/>
+        <w:gridCol w:w="1795"/>
+        <w:gridCol w:w="1795"/>
+        <w:gridCol w:w="1795"/>
+        <w:gridCol w:w="1795"/>
       </w:tblGrid>
       <w:tr>
         <w:tc>
           <w:tcPr>
-            <w:tcW w:type="dxa" w:w="3591"/>
+            <w:tcW w:w="1701" w:type="dxa"/>
             <w:shd w:fill="1A1A2E"/>
             <w:tcBorders>
               <w:top w:val="none"/>
@@ -299,9 +301,6 @@
             </w:tcBorders>
           </w:tcPr>
           <w:p>
-            <w:pPr>
-              <w:jc w:val="left"/>
-            </w:pPr>
             <w:r>
               <w:rPr>
                 <w:b/>
@@ -315,7 +314,7 @@
         </w:tc>
         <w:tc>
           <w:tcPr>
-            <w:tcW w:type="dxa" w:w="3591"/>
+            <w:tcW w:w="680" w:type="dxa"/>
             <w:shd w:fill="1A1A2E"/>
             <w:tcBorders>
               <w:top w:val="none"/>
@@ -341,7 +340,7 @@
         </w:tc>
         <w:tc>
           <w:tcPr>
-            <w:tcW w:type="dxa" w:w="3591"/>
+            <w:tcW w:w="680" w:type="dxa"/>
             <w:shd w:fill="1A1A2E"/>
             <w:tcBorders>
               <w:top w:val="none"/>
@@ -365,11 +364,73 @@
             </w:r>
           </w:p>
         </w:tc>
+        <w:tc>
+          <w:tcPr>
+            <w:tcW w:w="170" w:type="dxa"/>
+            <w:shd w:fill="1A1A2E"/>
+            <w:tcBorders>
+              <w:top w:val="none"/>
+              <w:left w:val="none"/>
+              <w:right w:val="none"/>
+              <w:bottom w:val="single" w:sz="2" w:space="0" w:color="D0C8B0"/>
+            </w:tcBorders>
+          </w:tcPr>
+          <w:p/>
+        </w:tc>
+        <w:tc>
+          <w:tcPr>
+            <w:tcW w:w="1134" w:type="dxa"/>
+            <w:shd w:fill="1A1A2E"/>
+            <w:tcBorders>
+              <w:top w:val="none"/>
+              <w:left w:val="none"/>
+              <w:right w:val="none"/>
+              <w:bottom w:val="single" w:sz="2" w:space="0" w:color="D0C8B0"/>
+            </w:tcBorders>
+          </w:tcPr>
+          <w:p>
+            <w:pPr>
+              <w:jc w:val="center"/>
+            </w:pPr>
+            <w:r>
+              <w:rPr>
+                <w:b/>
+                <w:i w:val="0"/>
+                <w:color w:val="FFFFFF"/>
+                <w:sz w:val="18"/>
+              </w:rPr>
+              <w:t>Valori</w:t>
+            </w:r>
+          </w:p>
+        </w:tc>
+        <w:tc>
+          <w:tcPr>
+            <w:tcW w:w="6407" w:type="dxa"/>
+            <w:shd w:fill="1A1A2E"/>
+            <w:tcBorders>
+              <w:top w:val="none"/>
+              <w:left w:val="none"/>
+              <w:right w:val="none"/>
+              <w:bottom w:val="single" w:sz="2" w:space="0" w:color="D0C8B0"/>
+            </w:tcBorders>
+          </w:tcPr>
+          <w:p>
+            <w:r>
+              <w:rPr>
+                <w:b/>
+                <w:i w:val="0"/>
+                <w:color w:val="FFFFFF"/>
+                <w:sz w:val="18"/>
+              </w:rPr>
+              <w:t>Note</w:t>
+            </w:r>
+          </w:p>
+        </w:tc>
       </w:tr>
       <w:tr>
         <w:tc>
           <w:tcPr>
-            <w:tcW w:type="dxa" w:w="3591"/>
+            <w:tcW w:w="1701" w:type="dxa"/>
             <w:shd w:fill="F5F3EB"/>
             <w:tcBorders>
               <w:top w:val="none"/>
@@ -386,13 +447,22 @@
                 <w:color w:val="1A1A2E"/>
                 <w:sz w:val="20"/>
               </w:rPr>
-              <w:t>Distacco 冷静</w:t>
+              <w:t xml:space="preserve">Distacco </w:t>
+            </w:r>
+            <w:r>
+              <w:rPr>
+                <w:b w:val="0"/>
+                <w:i w:val="0"/>
+                <w:color w:val="1A1A2E"/>
+                <w:sz w:val="20"/>
+              </w:rPr>
+              <w:t>冷静</w:t>
             </w:r>
           </w:p>
         </w:tc>
         <w:tc>
           <w:tcPr>
-            <w:tcW w:type="dxa" w:w="3591"/>
+            <w:tcW w:w="680" w:type="dxa"/>
             <w:shd w:fill="F5F3EB"/>
             <w:tcBorders>
               <w:top w:val="none"/>
@@ -418,7 +488,7 @@
         </w:tc>
         <w:tc>
           <w:tcPr>
-            <w:tcW w:type="dxa" w:w="3591"/>
+            <w:tcW w:w="680" w:type="dxa"/>
             <w:shd w:fill="F5F3EB"/>
             <w:tcBorders>
               <w:top w:val="none"/>
@@ -431,13 +501,58 @@
             <w:pPr>
               <w:jc w:val="center"/>
             </w:pPr>
+          </w:p>
+        </w:tc>
+        <w:tc>
+          <w:tcPr>
+            <w:tcW w:w="170" w:type="dxa"/>
+            <w:shd w:fill="F5F3EB"/>
+            <w:tcBorders>
+              <w:top w:val="none"/>
+              <w:left w:val="none"/>
+              <w:right w:val="none"/>
+              <w:bottom w:val="single" w:sz="2" w:space="0" w:color="D0C8B0"/>
+            </w:tcBorders>
+          </w:tcPr>
+          <w:p/>
+        </w:tc>
+        <w:tc>
+          <w:tcPr>
+            <w:tcW w:w="1134" w:type="dxa"/>
+            <w:shd w:fill="F5F3EB"/>
+            <w:tcBorders>
+              <w:top w:val="none"/>
+              <w:left w:val="none"/>
+              <w:right w:val="none"/>
+              <w:bottom w:val="single" w:sz="2" w:space="0" w:color="D0C8B0"/>
+            </w:tcBorders>
+          </w:tcPr>
+          <w:p>
+            <w:pPr>
+              <w:jc w:val="center"/>
+            </w:pPr>
+          </w:p>
+        </w:tc>
+        <w:tc>
+          <w:tcPr>
+            <w:tcW w:w="6407" w:type="dxa"/>
+            <w:shd w:fill="F5F3EB"/>
+            <w:tcBorders>
+              <w:top w:val="none"/>
+              <w:left w:val="none"/>
+              <w:right w:val="none"/>
+              <w:bottom w:val="single" w:sz="2" w:space="0" w:color="D0C8B0"/>
+            </w:tcBorders>
+          </w:tcPr>
+          <w:p>
             <w:r>
               <w:rPr>
                 <w:b w:val="0"/>
                 <w:i w:val="0"/>
-                <w:color w:val="787878"/>
-                <w:sz w:val="24"/>
+                <w:color w:val="1A1A2E"/>
+                <w:sz w:val="16"/>
               </w:rPr>
+              <w:t>Non farti coinvolgere emotivamente. Restare lucido davanti all'orrore. Mantenere la distanza professionale quando tutto ti spinge a reagire.</w:t>
             </w:r>
           </w:p>
         </w:tc>
@@ -445,7 +560,7 @@
       <w:tr>
         <w:tc>
           <w:tcPr>
-            <w:tcW w:type="dxa" w:w="3591"/>
+            <w:tcW w:w="1701" w:type="dxa"/>
             <w:tcBorders>
               <w:top w:val="none"/>
               <w:left w:val="none"/>
@@ -461,13 +576,22 @@
                 <w:color w:val="1A1A2E"/>
                 <w:sz w:val="20"/>
               </w:rPr>
-              <w:t>Pazienza 忍耐</w:t>
+              <w:t xml:space="preserve">Pazienza </w:t>
+            </w:r>
+            <w:r>
+              <w:rPr>
+                <w:b w:val="0"/>
+                <w:i w:val="0"/>
+                <w:color w:val="1A1A2E"/>
+                <w:sz w:val="20"/>
+              </w:rPr>
+              <w:t>忍耐</w:t>
             </w:r>
           </w:p>
         </w:tc>
         <w:tc>
           <w:tcPr>
-            <w:tcW w:type="dxa" w:w="3591"/>
+            <w:tcW w:w="680" w:type="dxa"/>
             <w:tcBorders>
               <w:top w:val="none"/>
               <w:left w:val="none"/>
@@ -492,7 +616,7 @@
         </w:tc>
         <w:tc>
           <w:tcPr>
-            <w:tcW w:type="dxa" w:w="3591"/>
+            <w:tcW w:w="680" w:type="dxa"/>
             <w:tcBorders>
               <w:top w:val="none"/>
               <w:left w:val="none"/>
@@ -504,13 +628,55 @@
             <w:pPr>
               <w:jc w:val="center"/>
             </w:pPr>
+          </w:p>
+        </w:tc>
+        <w:tc>
+          <w:tcPr>
+            <w:tcW w:w="170" w:type="dxa"/>
+            <w:tcBorders>
+              <w:top w:val="none"/>
+              <w:left w:val="none"/>
+              <w:right w:val="none"/>
+              <w:bottom w:val="single" w:sz="2" w:space="0" w:color="D0C8B0"/>
+            </w:tcBorders>
+          </w:tcPr>
+          <w:p/>
+        </w:tc>
+        <w:tc>
+          <w:tcPr>
+            <w:tcW w:w="1134" w:type="dxa"/>
+            <w:tcBorders>
+              <w:top w:val="none"/>
+              <w:left w:val="none"/>
+              <w:right w:val="none"/>
+              <w:bottom w:val="single" w:sz="2" w:space="0" w:color="D0C8B0"/>
+            </w:tcBorders>
+          </w:tcPr>
+          <w:p>
+            <w:pPr>
+              <w:jc w:val="center"/>
+            </w:pPr>
+          </w:p>
+        </w:tc>
+        <w:tc>
+          <w:tcPr>
+            <w:tcW w:w="6407" w:type="dxa"/>
+            <w:tcBorders>
+              <w:top w:val="none"/>
+              <w:left w:val="none"/>
+              <w:right w:val="none"/>
+              <w:bottom w:val="single" w:sz="2" w:space="0" w:color="D0C8B0"/>
+            </w:tcBorders>
+          </w:tcPr>
+          <w:p>
             <w:r>
               <w:rPr>
                 <w:b w:val="0"/>
                 <w:i w:val="0"/>
-                <w:color w:val="787878"/>
-                <w:sz w:val="24"/>
+                <w:color w:val="1A1A2E"/>
+                <w:sz w:val="16"/>
               </w:rPr>
+              <w:t>Resistere alla fretta. Aspettare il momento giusto. Sopportare lunghe attese senza cedere alla pressione del tempo.</w:t>
             </w:r>
           </w:p>
         </w:tc>
@@ -518,7 +684,7 @@
       <w:tr>
         <w:tc>
           <w:tcPr>
-            <w:tcW w:type="dxa" w:w="3591"/>
+            <w:tcW w:w="1701" w:type="dxa"/>
             <w:shd w:fill="F5F3EB"/>
             <w:tcBorders>
               <w:top w:val="none"/>
@@ -535,13 +701,22 @@
                 <w:color w:val="1A1A2E"/>
                 <w:sz w:val="20"/>
               </w:rPr>
-              <w:t>Silenzio 沈黙</w:t>
+              <w:t xml:space="preserve">Silenzio </w:t>
+            </w:r>
+            <w:r>
+              <w:rPr>
+                <w:b w:val="0"/>
+                <w:i w:val="0"/>
+                <w:color w:val="1A1A2E"/>
+                <w:sz w:val="20"/>
+              </w:rPr>
+              <w:t>沈黙</w:t>
             </w:r>
           </w:p>
         </w:tc>
         <w:tc>
           <w:tcPr>
-            <w:tcW w:type="dxa" w:w="3591"/>
+            <w:tcW w:w="680" w:type="dxa"/>
             <w:shd w:fill="F5F3EB"/>
             <w:tcBorders>
               <w:top w:val="none"/>
@@ -567,7 +742,7 @@
         </w:tc>
         <w:tc>
           <w:tcPr>
-            <w:tcW w:type="dxa" w:w="3591"/>
+            <w:tcW w:w="680" w:type="dxa"/>
             <w:shd w:fill="F5F3EB"/>
             <w:tcBorders>
               <w:top w:val="none"/>
@@ -580,13 +755,58 @@
             <w:pPr>
               <w:jc w:val="center"/>
             </w:pPr>
+          </w:p>
+        </w:tc>
+        <w:tc>
+          <w:tcPr>
+            <w:tcW w:w="170" w:type="dxa"/>
+            <w:shd w:fill="F5F3EB"/>
+            <w:tcBorders>
+              <w:top w:val="none"/>
+              <w:left w:val="none"/>
+              <w:right w:val="none"/>
+              <w:bottom w:val="single" w:sz="2" w:space="0" w:color="D0C8B0"/>
+            </w:tcBorders>
+          </w:tcPr>
+          <w:p/>
+        </w:tc>
+        <w:tc>
+          <w:tcPr>
+            <w:tcW w:w="1134" w:type="dxa"/>
+            <w:shd w:fill="F5F3EB"/>
+            <w:tcBorders>
+              <w:top w:val="none"/>
+              <w:left w:val="none"/>
+              <w:right w:val="none"/>
+              <w:bottom w:val="single" w:sz="2" w:space="0" w:color="D0C8B0"/>
+            </w:tcBorders>
+          </w:tcPr>
+          <w:p>
+            <w:pPr>
+              <w:jc w:val="center"/>
+            </w:pPr>
+          </w:p>
+        </w:tc>
+        <w:tc>
+          <w:tcPr>
+            <w:tcW w:w="6407" w:type="dxa"/>
+            <w:shd w:fill="F5F3EB"/>
+            <w:tcBorders>
+              <w:top w:val="none"/>
+              <w:left w:val="none"/>
+              <w:right w:val="none"/>
+              <w:bottom w:val="single" w:sz="2" w:space="0" w:color="D0C8B0"/>
+            </w:tcBorders>
+          </w:tcPr>
+          <w:p>
             <w:r>
               <w:rPr>
                 <w:b w:val="0"/>
                 <w:i w:val="0"/>
-                <w:color w:val="787878"/>
-                <w:sz w:val="24"/>
+                <w:color w:val="1A1A2E"/>
+                <w:sz w:val="16"/>
               </w:rPr>
+              <w:t>Calma interiore. Non reagire d'impulso. Incassare provocazioni senza esplodere. Non tradire le tue intenzioni con un gesto o una parola di troppo.</w:t>
             </w:r>
           </w:p>
         </w:tc>
@@ -594,7 +814,7 @@
       <w:tr>
         <w:tc>
           <w:tcPr>
-            <w:tcW w:type="dxa" w:w="3591"/>
+            <w:tcW w:w="1701" w:type="dxa"/>
             <w:tcBorders>
               <w:top w:val="none"/>
               <w:left w:val="none"/>
@@ -610,13 +830,22 @@
                 <w:color w:val="1A1A2E"/>
                 <w:sz w:val="20"/>
               </w:rPr>
-              <w:t>Lucidità 明晰</w:t>
+              <w:t xml:space="preserve">Lucidità </w:t>
+            </w:r>
+            <w:r>
+              <w:rPr>
+                <w:b w:val="0"/>
+                <w:i w:val="0"/>
+                <w:color w:val="1A1A2E"/>
+                <w:sz w:val="20"/>
+              </w:rPr>
+              <w:t>明晰</w:t>
             </w:r>
           </w:p>
         </w:tc>
         <w:tc>
           <w:tcPr>
-            <w:tcW w:type="dxa" w:w="3591"/>
+            <w:tcW w:w="680" w:type="dxa"/>
             <w:tcBorders>
               <w:top w:val="none"/>
               <w:left w:val="none"/>
@@ -641,7 +870,7 @@
         </w:tc>
         <w:tc>
           <w:tcPr>
-            <w:tcW w:type="dxa" w:w="3591"/>
+            <w:tcW w:w="680" w:type="dxa"/>
             <w:tcBorders>
               <w:top w:val="none"/>
               <w:left w:val="none"/>
@@ -653,13 +882,55 @@
             <w:pPr>
               <w:jc w:val="center"/>
             </w:pPr>
+          </w:p>
+        </w:tc>
+        <w:tc>
+          <w:tcPr>
+            <w:tcW w:w="170" w:type="dxa"/>
+            <w:tcBorders>
+              <w:top w:val="none"/>
+              <w:left w:val="none"/>
+              <w:right w:val="none"/>
+              <w:bottom w:val="single" w:sz="2" w:space="0" w:color="D0C8B0"/>
+            </w:tcBorders>
+          </w:tcPr>
+          <w:p/>
+        </w:tc>
+        <w:tc>
+          <w:tcPr>
+            <w:tcW w:w="1134" w:type="dxa"/>
+            <w:tcBorders>
+              <w:top w:val="none"/>
+              <w:left w:val="none"/>
+              <w:right w:val="none"/>
+              <w:bottom w:val="single" w:sz="2" w:space="0" w:color="D0C8B0"/>
+            </w:tcBorders>
+          </w:tcPr>
+          <w:p>
+            <w:pPr>
+              <w:jc w:val="center"/>
+            </w:pPr>
+          </w:p>
+        </w:tc>
+        <w:tc>
+          <w:tcPr>
+            <w:tcW w:w="6407" w:type="dxa"/>
+            <w:tcBorders>
+              <w:top w:val="none"/>
+              <w:left w:val="none"/>
+              <w:right w:val="none"/>
+              <w:bottom w:val="single" w:sz="2" w:space="0" w:color="D0C8B0"/>
+            </w:tcBorders>
+          </w:tcPr>
+          <w:p>
             <w:r>
               <w:rPr>
                 <w:b w:val="0"/>
                 <w:i w:val="0"/>
-                <w:color w:val="787878"/>
-                <w:sz w:val="24"/>
+                <w:color w:val="1A1A2E"/>
+                <w:sz w:val="16"/>
               </w:rPr>
+              <w:t>Vedere chiaro. Collegare i pezzi. Capire cosa è importante e cosa no. Ricostruire cosa è successo da quello che resta.</w:t>
             </w:r>
           </w:p>
         </w:tc>
@@ -667,7 +938,7 @@
       <w:tr>
         <w:tc>
           <w:tcPr>
-            <w:tcW w:type="dxa" w:w="3591"/>
+            <w:tcW w:w="1701" w:type="dxa"/>
             <w:shd w:fill="F5F3EB"/>
             <w:tcBorders>
               <w:top w:val="none"/>
@@ -684,13 +955,22 @@
                 <w:color w:val="1A1A2E"/>
                 <w:sz w:val="20"/>
               </w:rPr>
-              <w:t>Ascolto 傾聴</w:t>
+              <w:t xml:space="preserve">Ascolto </w:t>
+            </w:r>
+            <w:r>
+              <w:rPr>
+                <w:b w:val="0"/>
+                <w:i w:val="0"/>
+                <w:color w:val="1A1A2E"/>
+                <w:sz w:val="20"/>
+              </w:rPr>
+              <w:t>傾聴</w:t>
             </w:r>
           </w:p>
         </w:tc>
         <w:tc>
           <w:tcPr>
-            <w:tcW w:type="dxa" w:w="3591"/>
+            <w:tcW w:w="680" w:type="dxa"/>
             <w:shd w:fill="F5F3EB"/>
             <w:tcBorders>
               <w:top w:val="none"/>
@@ -716,7 +996,7 @@
         </w:tc>
         <w:tc>
           <w:tcPr>
-            <w:tcW w:type="dxa" w:w="3591"/>
+            <w:tcW w:w="680" w:type="dxa"/>
             <w:shd w:fill="F5F3EB"/>
             <w:tcBorders>
               <w:top w:val="none"/>
@@ -729,13 +1009,58 @@
             <w:pPr>
               <w:jc w:val="center"/>
             </w:pPr>
+          </w:p>
+        </w:tc>
+        <w:tc>
+          <w:tcPr>
+            <w:tcW w:w="170" w:type="dxa"/>
+            <w:shd w:fill="F5F3EB"/>
+            <w:tcBorders>
+              <w:top w:val="none"/>
+              <w:left w:val="none"/>
+              <w:right w:val="none"/>
+              <w:bottom w:val="single" w:sz="2" w:space="0" w:color="D0C8B0"/>
+            </w:tcBorders>
+          </w:tcPr>
+          <w:p/>
+        </w:tc>
+        <w:tc>
+          <w:tcPr>
+            <w:tcW w:w="1134" w:type="dxa"/>
+            <w:shd w:fill="F5F3EB"/>
+            <w:tcBorders>
+              <w:top w:val="none"/>
+              <w:left w:val="none"/>
+              <w:right w:val="none"/>
+              <w:bottom w:val="single" w:sz="2" w:space="0" w:color="D0C8B0"/>
+            </w:tcBorders>
+          </w:tcPr>
+          <w:p>
+            <w:pPr>
+              <w:jc w:val="center"/>
+            </w:pPr>
+          </w:p>
+        </w:tc>
+        <w:tc>
+          <w:tcPr>
+            <w:tcW w:w="6407" w:type="dxa"/>
+            <w:shd w:fill="F5F3EB"/>
+            <w:tcBorders>
+              <w:top w:val="none"/>
+              <w:left w:val="none"/>
+              <w:right w:val="none"/>
+              <w:bottom w:val="single" w:sz="2" w:space="0" w:color="D0C8B0"/>
+            </w:tcBorders>
+          </w:tcPr>
+          <w:p>
             <w:r>
               <w:rPr>
                 <w:b w:val="0"/>
                 <w:i w:val="0"/>
-                <w:color w:val="787878"/>
-                <w:sz w:val="24"/>
+                <w:color w:val="1A1A2E"/>
+                <w:sz w:val="16"/>
               </w:rPr>
+              <w:t>Far parlare gli altri. Cogliere il non detto. Leggere tra le righe. Sentire quando qualcosa non torna in quello che qualcuno ti sta dicendo.</w:t>
             </w:r>
           </w:p>
         </w:tc>
@@ -743,7 +1068,7 @@
       <w:tr>
         <w:tc>
           <w:tcPr>
-            <w:tcW w:type="dxa" w:w="3591"/>
+            <w:tcW w:w="1701" w:type="dxa"/>
             <w:tcBorders>
               <w:top w:val="none"/>
               <w:left w:val="none"/>
@@ -759,13 +1084,22 @@
                 <w:color w:val="1A1A2E"/>
                 <w:sz w:val="20"/>
               </w:rPr>
-              <w:t>Presenza 存在</w:t>
+              <w:t xml:space="preserve">Presenza </w:t>
+            </w:r>
+            <w:r>
+              <w:rPr>
+                <w:b w:val="0"/>
+                <w:i w:val="0"/>
+                <w:color w:val="1A1A2E"/>
+                <w:sz w:val="20"/>
+              </w:rPr>
+              <w:t>存在</w:t>
             </w:r>
           </w:p>
         </w:tc>
         <w:tc>
           <w:tcPr>
-            <w:tcW w:type="dxa" w:w="3591"/>
+            <w:tcW w:w="680" w:type="dxa"/>
             <w:tcBorders>
               <w:top w:val="none"/>
               <w:left w:val="none"/>
@@ -790,7 +1124,7 @@
         </w:tc>
         <w:tc>
           <w:tcPr>
-            <w:tcW w:type="dxa" w:w="3591"/>
+            <w:tcW w:w="680" w:type="dxa"/>
             <w:tcBorders>
               <w:top w:val="none"/>
               <w:left w:val="none"/>
@@ -802,13 +1136,55 @@
             <w:pPr>
               <w:jc w:val="center"/>
             </w:pPr>
+          </w:p>
+        </w:tc>
+        <w:tc>
+          <w:tcPr>
+            <w:tcW w:w="170" w:type="dxa"/>
+            <w:tcBorders>
+              <w:top w:val="none"/>
+              <w:left w:val="none"/>
+              <w:right w:val="none"/>
+              <w:bottom w:val="single" w:sz="2" w:space="0" w:color="D0C8B0"/>
+            </w:tcBorders>
+          </w:tcPr>
+          <w:p/>
+        </w:tc>
+        <w:tc>
+          <w:tcPr>
+            <w:tcW w:w="1134" w:type="dxa"/>
+            <w:tcBorders>
+              <w:top w:val="none"/>
+              <w:left w:val="none"/>
+              <w:right w:val="none"/>
+              <w:bottom w:val="single" w:sz="2" w:space="0" w:color="D0C8B0"/>
+            </w:tcBorders>
+          </w:tcPr>
+          <w:p>
+            <w:pPr>
+              <w:jc w:val="center"/>
+            </w:pPr>
+          </w:p>
+        </w:tc>
+        <w:tc>
+          <w:tcPr>
+            <w:tcW w:w="6407" w:type="dxa"/>
+            <w:tcBorders>
+              <w:top w:val="none"/>
+              <w:left w:val="none"/>
+              <w:right w:val="none"/>
+              <w:bottom w:val="single" w:sz="2" w:space="0" w:color="D0C8B0"/>
+            </w:tcBorders>
+          </w:tcPr>
+          <w:p>
             <w:r>
               <w:rPr>
                 <w:b w:val="0"/>
                 <w:i w:val="0"/>
-                <w:color w:val="787878"/>
-                <w:sz w:val="24"/>
+                <w:color w:val="1A1A2E"/>
+                <w:sz w:val="16"/>
               </w:rPr>
+              <w:t>L'autorità che ispiri. Farti prendere sul serio. Intimidire, comandare attenzione, far pesare la tua posizione in una stanza.</w:t>
             </w:r>
           </w:p>
         </w:tc>
@@ -840,162 +1216,6 @@
     </w:p>
     <w:p>
       <w:pPr>
-        <w:spacing w:after="40"/>
-        <w:ind w:left="170"/>
-      </w:pPr>
-      <w:r>
-        <w:rPr>
-          <w:b/>
-          <w:i w:val="0"/>
-          <w:color w:val="787878"/>
-          <w:sz w:val="16"/>
-        </w:rPr>
-        <w:t xml:space="preserve">Distacco: </w:t>
-      </w:r>
-      <w:r>
-        <w:rPr>
-          <w:b w:val="0"/>
-          <w:i/>
-          <w:color w:val="787878"/>
-          <w:sz w:val="16"/>
-        </w:rPr>
-        <w:t>scene brutali, non farti coinvolgere</w:t>
-      </w:r>
-      <w:r>
-        <w:rPr>
-          <w:b w:val="0"/>
-          <w:i w:val="0"/>
-          <w:color w:val="B49650"/>
-          <w:sz w:val="16"/>
-        </w:rPr>
-        <w:t xml:space="preserve">  ·  </w:t>
-      </w:r>
-      <w:r>
-        <w:rPr>
-          <w:b/>
-          <w:i w:val="0"/>
-          <w:color w:val="787878"/>
-          <w:sz w:val="16"/>
-        </w:rPr>
-        <w:t xml:space="preserve">Pazienza: </w:t>
-      </w:r>
-      <w:r>
-        <w:rPr>
-          <w:b w:val="0"/>
-          <w:i/>
-          <w:color w:val="787878"/>
-          <w:sz w:val="16"/>
-        </w:rPr>
-        <w:t>attese, interrogatori lunghi</w:t>
-      </w:r>
-      <w:r>
-        <w:rPr>
-          <w:b w:val="0"/>
-          <w:i w:val="0"/>
-          <w:color w:val="B49650"/>
-          <w:sz w:val="16"/>
-        </w:rPr>
-        <w:t xml:space="preserve">  ·  </w:t>
-      </w:r>
-      <w:r>
-        <w:rPr>
-          <w:b/>
-          <w:i w:val="0"/>
-          <w:color w:val="787878"/>
-          <w:sz w:val="16"/>
-        </w:rPr>
-        <w:t xml:space="preserve">Silenzio: </w:t>
-      </w:r>
-      <w:r>
-        <w:rPr>
-          <w:b w:val="0"/>
-          <w:i/>
-          <w:color w:val="787878"/>
-          <w:sz w:val="16"/>
-        </w:rPr>
-        <w:t>incassare, non reagire</w:t>
-      </w:r>
-    </w:p>
-    <w:p>
-      <w:pPr>
-        <w:spacing w:after="40"/>
-        <w:ind w:left="170"/>
-      </w:pPr>
-      <w:r>
-        <w:rPr>
-          <w:b/>
-          <w:i w:val="0"/>
-          <w:color w:val="787878"/>
-          <w:sz w:val="16"/>
-        </w:rPr>
-        <w:t xml:space="preserve">Lucidità: </w:t>
-      </w:r>
-      <w:r>
-        <w:rPr>
-          <w:b w:val="0"/>
-          <w:i/>
-          <w:color w:val="787878"/>
-          <w:sz w:val="16"/>
-        </w:rPr>
-        <w:t>analizzare, ricostruire</w:t>
-      </w:r>
-      <w:r>
-        <w:rPr>
-          <w:b w:val="0"/>
-          <w:i w:val="0"/>
-          <w:color w:val="B49650"/>
-          <w:sz w:val="16"/>
-        </w:rPr>
-        <w:t xml:space="preserve">  ·  </w:t>
-      </w:r>
-      <w:r>
-        <w:rPr>
-          <w:b/>
-          <w:i w:val="0"/>
-          <w:color w:val="787878"/>
-          <w:sz w:val="16"/>
-        </w:rPr>
-        <w:t xml:space="preserve">Ascolto: </w:t>
-      </w:r>
-      <w:r>
-        <w:rPr>
-          <w:b w:val="0"/>
-          <w:i/>
-          <w:color w:val="787878"/>
-          <w:sz w:val="16"/>
-        </w:rPr>
-        <w:t>cogliere bugie, far parlare</w:t>
-      </w:r>
-      <w:r>
-        <w:rPr>
-          <w:b w:val="0"/>
-          <w:i w:val="0"/>
-          <w:color w:val="B49650"/>
-          <w:sz w:val="16"/>
-        </w:rPr>
-        <w:t xml:space="preserve">  ·  </w:t>
-      </w:r>
-      <w:r>
-        <w:rPr>
-          <w:b/>
-          <w:i w:val="0"/>
-          <w:color w:val="787878"/>
-          <w:sz w:val="16"/>
-        </w:rPr>
-        <w:t xml:space="preserve">Presenza: </w:t>
-      </w:r>
-      <w:r>
-        <w:rPr>
-          <w:b w:val="0"/>
-          <w:i/>
-          <w:color w:val="787878"/>
-          <w:sz w:val="16"/>
-        </w:rPr>
-        <w:t>fare pressione, autorità</w:t>
-      </w:r>
-    </w:p>
-    <w:p>
-      <w:pPr>
         <w:spacing w:before="120" w:after="120"/>
         <w:jc w:val="center"/>
       </w:pPr>
@@ -1009,128 +1229,157 @@
         <w:t>━━━━━━━━━━━━━━━━━━━━━━━━━━━━━━━━━━━━━━━━━━━━━━━━━━━━━━━━━━━━━━━━━━━━━━</w:t>
       </w:r>
     </w:p>
-    <w:p>
-      <w:pPr>
-        <w:spacing w:before="160" w:after="80"/>
-      </w:pPr>
-      <w:r>
-        <w:rPr>
-          <w:b w:val="0"/>
-          <w:i w:val="0"/>
-          <w:color w:val="B49650"/>
-          <w:sz w:val="26"/>
-        </w:rPr>
-        <w:t>気</w:t>
-      </w:r>
-      <w:r>
-        <w:rPr>
-          <w:b w:val="0"/>
-          <w:i w:val="0"/>
-          <w:color w:val="1A1A2E"/>
-          <w:sz w:val="26"/>
-        </w:rPr>
-        <w:t xml:space="preserve">  </w:t>
-      </w:r>
-      <w:r>
-        <w:rPr>
-          <w:b/>
-          <w:i w:val="0"/>
-          <w:color w:val="1A1A2E"/>
-          <w:sz w:val="22"/>
-        </w:rPr>
-        <w:t>KI — TENUTA</w:t>
-      </w:r>
-    </w:p>
-    <w:p>
-      <w:pPr>
-        <w:spacing w:after="80"/>
-        <w:ind w:left="170"/>
-      </w:pPr>
-      <w:r>
-        <w:rPr>
-          <w:b w:val="0"/>
-          <w:i/>
-          <w:color w:val="787878"/>
-          <w:sz w:val="18"/>
-        </w:rPr>
-        <w:t>Attributo Finale più basso + 2d6 (prendi il dado più alto). Se esce 1, ritira.</w:t>
-      </w:r>
-    </w:p>
-    <w:p>
-      <w:pPr>
-        <w:spacing w:after="40"/>
-        <w:ind w:left="170"/>
-      </w:pPr>
-      <w:r>
-        <w:rPr>
-          <w:b/>
-          <w:i w:val="0"/>
-          <w:color w:val="1A1A2E"/>
-          <w:sz w:val="24"/>
-        </w:rPr>
-        <w:t>Ki Max: ________</w:t>
-      </w:r>
-      <w:r>
-        <w:rPr>
-          <w:b w:val="0"/>
-          <w:i/>
-          <w:color w:val="8B0000"/>
-          <w:sz w:val="18"/>
-        </w:rPr>
-        <w:t xml:space="preserve">     ≤3 Genkai</w:t>
-      </w:r>
-    </w:p>
-    <w:p>
-      <w:pPr>
-        <w:spacing w:after="40"/>
-        <w:ind w:left="170"/>
-      </w:pPr>
-      <w:r>
-        <w:rPr>
-          <w:b/>
-          <w:i w:val="0"/>
-          <w:color w:val="1A1A2E"/>
-          <w:sz w:val="24"/>
-        </w:rPr>
-        <w:t>Ki attuale: ________</w:t>
-      </w:r>
-      <w:r>
-        <w:rPr>
-          <w:b w:val="0"/>
-          <w:i w:val="0"/>
-          <w:color w:val="1A1A2E"/>
-          <w:sz w:val="20"/>
-        </w:rPr>
-        <w:t xml:space="preserve">          </w:t>
-      </w:r>
-      <w:r>
-        <w:rPr>
-          <w:b w:val="0"/>
-          <w:i w:val="0"/>
-          <w:color w:val="B49650"/>
-          <w:sz w:val="24"/>
-        </w:rPr>
-        <w:t>悟り</w:t>
-      </w:r>
-      <w:r>
-        <w:rPr>
-          <w:b w:val="0"/>
-          <w:i w:val="0"/>
-          <w:color w:val="1A1A2E"/>
-          <w:sz w:val="18"/>
-        </w:rPr>
-        <w:t xml:space="preserve">  SATORI — 1/sessione, successo automatico  </w:t>
-      </w:r>
-      <w:r>
-        <w:rPr>
-          <w:b w:val="0"/>
-          <w:i w:val="0"/>
-          <w:color w:val="1A1A2E"/>
-          <w:sz w:val="22"/>
-        </w:rPr>
-        <w:t>☐</w:t>
-      </w:r>
-    </w:p>
+    <w:tbl>
+      <w:tblPr>
+        <w:tblW w:type="auto" w:w="0"/>
+        <w:jc w:val="center"/>
+        <w:tblLook w:firstColumn="1" w:firstRow="1" w:lastColumn="0" w:lastRow="0" w:noHBand="0" w:noVBand="1" w:val="04A0"/>
+      </w:tblPr>
+      <w:tblGrid>
+        <w:gridCol w:w="5386"/>
+        <w:gridCol w:w="5386"/>
+      </w:tblGrid>
+      <w:tr>
+        <w:tc>
+          <w:tcPr>
+            <w:tcW w:w="6804" w:type="dxa"/>
+            <w:vAlign w:val="top"/>
+            <w:tcBorders>
+              <w:top w:val="none"/>
+              <w:left w:val="none"/>
+              <w:right w:val="none"/>
+              <w:bottom w:val="none"/>
+            </w:tcBorders>
+          </w:tcPr>
+          <w:p>
+            <w:pPr>
+              <w:spacing w:after="60"/>
+            </w:pPr>
+            <w:r>
+              <w:rPr>
+                <w:b w:val="0"/>
+                <w:i w:val="0"/>
+                <w:color w:val="B49650"/>
+                <w:sz w:val="24"/>
+              </w:rPr>
+              <w:t>気</w:t>
+            </w:r>
+            <w:r>
+              <w:rPr>
+                <w:b/>
+                <w:i w:val="0"/>
+                <w:color w:val="1A1A2E"/>
+                <w:sz w:val="20"/>
+              </w:rPr>
+              <w:t xml:space="preserve">  KI  — Tenuta</w:t>
+            </w:r>
+          </w:p>
+          <w:p>
+            <w:pPr>
+              <w:spacing w:after="40"/>
+            </w:pPr>
+            <w:r>
+              <w:rPr>
+                <w:b/>
+                <w:i w:val="0"/>
+                <w:color w:val="1A1A2E"/>
+                <w:sz w:val="22"/>
+              </w:rPr>
+              <w:t xml:space="preserve">Ki Max: ________    </w:t>
+            </w:r>
+            <w:r>
+              <w:rPr>
+                <w:b w:val="0"/>
+                <w:i/>
+                <w:color w:val="8B0000"/>
+                <w:sz w:val="16"/>
+              </w:rPr>
+              <w:t>attributo più basso +2d6 valore più basso, 1 si ritira</w:t>
+            </w:r>
+          </w:p>
+          <w:p>
+            <w:r>
+              <w:rPr>
+                <w:b/>
+                <w:i w:val="0"/>
+                <w:color w:val="1A1A2E"/>
+                <w:sz w:val="22"/>
+              </w:rPr>
+              <w:t xml:space="preserve">Ki attuale: ________________ </w:t>
+            </w:r>
+            <w:r>
+              <w:rPr>
+                <w:b w:val="0"/>
+                <w:i/>
+                <w:color w:val="8B0000"/>
+                <w:sz w:val="18"/>
+              </w:rPr>
+              <w:t>≤3 Genkai</w:t>
+            </w:r>
+          </w:p>
+        </w:tc>
+        <w:tc>
+          <w:tcPr>
+            <w:tcW w:w="3969" w:type="dxa"/>
+            <w:vAlign w:val="top"/>
+            <w:tcBorders>
+              <w:top w:val="none"/>
+              <w:left w:val="none"/>
+              <w:right w:val="none"/>
+              <w:bottom w:val="none"/>
+            </w:tcBorders>
+          </w:tcPr>
+          <w:p>
+            <w:pPr>
+              <w:spacing w:after="60"/>
+            </w:pPr>
+            <w:r>
+              <w:rPr>
+                <w:b w:val="0"/>
+                <w:i w:val="0"/>
+                <w:color w:val="B49650"/>
+                <w:sz w:val="24"/>
+              </w:rPr>
+              <w:t>悟り</w:t>
+            </w:r>
+            <w:r>
+              <w:rPr>
+                <w:b/>
+                <w:i w:val="0"/>
+                <w:color w:val="1A1A2E"/>
+                <w:sz w:val="20"/>
+              </w:rPr>
+              <w:t xml:space="preserve">  SATORI</w:t>
+            </w:r>
+          </w:p>
+          <w:p>
+            <w:pPr>
+              <w:spacing w:after="40"/>
+            </w:pPr>
+            <w:r>
+              <w:rPr>
+                <w:b w:val="0"/>
+                <w:i w:val="0"/>
+                <w:color w:val="787878"/>
+                <w:sz w:val="18"/>
+              </w:rPr>
+              <w:t>1/sessione</w:t>
+            </w:r>
+          </w:p>
+          <w:p>
+            <w:r>
+              <w:rPr>
+                <w:b w:val="0"/>
+                <w:i w:val="0"/>
+                <w:color w:val="1A1A2E"/>
+                <w:sz w:val="18"/>
+              </w:rPr>
+              <w:t>successo automatico ☐</w:t>
+            </w:r>
+          </w:p>
+        </w:tc>
+      </w:tr>
+    </w:tbl>
     <w:p>
       <w:pPr>
         <w:spacing w:before="120" w:after="120"/>
@@ -1198,26 +1447,10 @@
             <w:r>
               <w:rPr>
                 <w:b w:val="0"/>
-                <w:i/>
-                <w:color w:val="B49650"/>
-                <w:sz w:val="18"/>
-              </w:rPr>
-              <w:t>情けは人の為ならず</w:t>
-            </w:r>
-          </w:p>
-          <w:p>
-            <w:pPr>
-              <w:spacing w:after="40"/>
-            </w:pPr>
-            <w:r>
-              <w:rPr>
-                <w:b w:val="0"/>
                 <w:i w:val="0"/>
                 <w:color w:val="787878"/>
                 <w:sz w:val="18"/>
               </w:rPr>
-              <w:t>Bonus Kiwami+/Nami+ perso → conserva 1 Ki.</w:t>
-              <w:br/>
               <w:t>Solo donabile a un altro PG giocando la scena.</w:t>
               <w:br/>
               <w:t>Si perde a fine sessione.</w:t>
@@ -1234,7 +1467,7 @@
                 <w:color w:val="1A1A2E"/>
                 <w:sz w:val="20"/>
               </w:rPr>
-              <w:t>Nasake:  ☐ Vuoto   ☐ Pieno</w:t>
+              <w:t>☐ Vuoto   ☐ Pieno</w:t>
             </w:r>
           </w:p>
         </w:tc>
@@ -1286,22 +1519,6 @@
               <w:t>Nami+ → +1    Kiwami+ → +2</w:t>
               <w:br/>
               <w:t>Nami- → -1     Kiwami- → -2</w:t>
-            </w:r>
-          </w:p>
-          <w:p>
-            <w:pPr>
-              <w:spacing w:after="40"/>
-            </w:pPr>
-            <w:r>
-              <w:rPr>
-                <w:b w:val="0"/>
-                <w:i w:val="0"/>
-                <w:color w:val="787878"/>
-                <w:sz w:val="18"/>
-              </w:rPr>
-              <w:t>≥ partenza → 2d6 migliore (reroll 1)</w:t>
-              <w:br/>
-              <w:t>&lt; partenza → 2d6 peggiore (reroll 1)</w:t>
             </w:r>
           </w:p>
           <w:p>
@@ -1410,10 +1627,10 @@
         <w:rPr>
           <w:b w:val="0"/>
           <w:i w:val="0"/>
-          <w:color w:val="B49650"/>
-          <w:sz w:val="20"/>
+          <w:color w:val="1A1A2E"/>
+          <w:sz w:val="22"/>
         </w:rPr>
-        <w:t xml:space="preserve">▸ </w:t>
+        <w:t xml:space="preserve">☐ </w:t>
       </w:r>
       <w:r>
         <w:rPr>
@@ -1548,10 +1765,10 @@
         <w:rPr>
           <w:b w:val="0"/>
           <w:i w:val="0"/>
-          <w:color w:val="B49650"/>
-          <w:sz w:val="20"/>
+          <w:color w:val="1A1A2E"/>
+          <w:sz w:val="22"/>
         </w:rPr>
-        <w:t xml:space="preserve">▸ </w:t>
+        <w:t xml:space="preserve">☐ </w:t>
       </w:r>
       <w:r>
         <w:rPr>
@@ -1686,10 +1903,10 @@
         <w:rPr>
           <w:b w:val="0"/>
           <w:i w:val="0"/>
-          <w:color w:val="B49650"/>
-          <w:sz w:val="20"/>
+          <w:color w:val="1A1A2E"/>
+          <w:sz w:val="22"/>
         </w:rPr>
-        <w:t xml:space="preserve">▸ </w:t>
+        <w:t xml:space="preserve">☐ </w:t>
       </w:r>
       <w:r>
         <w:rPr>
@@ -1831,70 +2048,8 @@
       </w:r>
     </w:p>
     <w:p>
-      <w:pPr>
-        <w:jc w:val="center"/>
-      </w:pPr>
-      <w:r>
-        <w:rPr>
-          <w:b w:val="0"/>
-          <w:i w:val="0"/>
-          <w:color w:val="787878"/>
-          <w:sz w:val="20"/>
-        </w:rPr>
-        <w:t>Gou scelto: ________________________________</w:t>
-      </w:r>
-    </w:p>
-    <w:p>
       <w:r>
         <w:br w:type="page"/>
-      </w:r>
-    </w:p>
-    <w:p>
-      <w:pPr>
-        <w:spacing w:after="40"/>
-        <w:jc w:val="center"/>
-      </w:pPr>
-      <w:r>
-        <w:rPr>
-          <w:b w:val="0"/>
-          <w:i w:val="0"/>
-          <w:color w:val="B49650"/>
-          <w:sz w:val="28"/>
-        </w:rPr>
-        <w:t>藤田 恵美</w:t>
-      </w:r>
-      <w:r>
-        <w:rPr>
-          <w:b w:val="0"/>
-          <w:i w:val="0"/>
-          <w:color w:val="B49650"/>
-          <w:sz w:val="24"/>
-        </w:rPr>
-        <w:t xml:space="preserve">  ·  </w:t>
-      </w:r>
-      <w:r>
-        <w:rPr>
-          <w:b/>
-          <w:i w:val="0"/>
-          <w:color w:val="1A1A2E"/>
-          <w:sz w:val="24"/>
-        </w:rPr>
-        <w:t>FUJITA Emi</w:t>
-      </w:r>
-    </w:p>
-    <w:p>
-      <w:pPr>
-        <w:spacing w:before="120" w:after="120"/>
-        <w:jc w:val="center"/>
-      </w:pPr>
-      <w:r>
-        <w:rPr>
-          <w:b w:val="0"/>
-          <w:i w:val="0"/>
-          <w:color w:val="B49650"/>
-          <w:sz w:val="12"/>
-        </w:rPr>
-        <w:t>━━━━━━━━━━━━━━━━━━━━━━━━━━━━━━━━━━━━━━━━━━━━━━━━━━━━━━━━━━━━━━━━━━━━━━</w:t>
       </w:r>
     </w:p>
     <w:p>
@@ -2796,7 +2951,7 @@
           <w:color w:val="787878"/>
           <w:sz w:val="20"/>
         </w:rPr>
-        <w:t xml:space="preserve">{{rapporto_1_nome}}: </w:t>
+        <w:t xml:space="preserve">YAMAMOTO Kenji: </w:t>
       </w:r>
       <w:r>
         <w:rPr>
@@ -2805,7 +2960,7 @@
           <w:color w:val="1A1A2E"/>
           <w:sz w:val="20"/>
         </w:rPr>
-        <w:t>{{rapporto_1_testo}}</w:t>
+        <w:t>Un buon capo, ma si sta consumando. Non è il mio ruolo dirglielo, ma qualcuno dovrebbe.</w:t>
       </w:r>
     </w:p>
     <w:p>
@@ -2820,7 +2975,7 @@
           <w:color w:val="787878"/>
           <w:sz w:val="20"/>
         </w:rPr>
-        <w:t xml:space="preserve">{{rapporto_2_nome}}: </w:t>
+        <w:t xml:space="preserve">HONDA Ryota: </w:t>
       </w:r>
       <w:r>
         <w:rPr>
@@ -2829,7 +2984,7 @@
           <w:color w:val="1A1A2E"/>
           <w:sz w:val="20"/>
         </w:rPr>
-        <w:t>{{rapporto_2_testo}}</w:t>
+        <w:t>Nasconde qualcosa. Non so cosa, ma il linguaggio del corpo non mente.</w:t>
       </w:r>
     </w:p>
     <w:p>
@@ -2844,7 +2999,7 @@
           <w:color w:val="787878"/>
           <w:sz w:val="20"/>
         </w:rPr>
-        <w:t xml:space="preserve">{{rapporto_3_nome}}: </w:t>
+        <w:t xml:space="preserve">NAKAMURA Shota: </w:t>
       </w:r>
       <w:r>
         <w:rPr>
@@ -2853,7 +3008,7 @@
           <w:color w:val="1A1A2E"/>
           <w:sz w:val="20"/>
         </w:rPr>
-        <w:t>{{rapporto_3_testo}}</w:t>
+        <w:t>L'unico che non mi ha mai chiesto perché non sono sposata. Per questo lo rispetto.</w:t>
       </w:r>
     </w:p>
     <w:p>
@@ -2868,7 +3023,7 @@
           <w:color w:val="787878"/>
           <w:sz w:val="20"/>
         </w:rPr>
-        <w:t xml:space="preserve">{{rapporto_4_nome}}: </w:t>
+        <w:t xml:space="preserve">SATO Yuki: </w:t>
       </w:r>
       <w:r>
         <w:rPr>
@@ -2877,7 +3032,7 @@
           <w:color w:val="1A1A2E"/>
           <w:sz w:val="20"/>
         </w:rPr>
-        <w:t>{{rapporto_4_testo}}</w:t>
+        <w:t>Giovane, entusiasta, fragile. Mi ricorda una versione di me che non esiste più.</w:t>
       </w:r>
     </w:p>
     <w:sectPr>

</xml_diff>

<commit_message>
vault backup: 2026-07-07 07:57:36
</commit_message>
<xml_diff>
--- a/Investigare/pg/ANTEPRIMA_Fujita_Emi.docx
+++ b/Investigare/pg/ANTEPRIMA_Fujita_Emi.docx
@@ -1317,6 +1317,29 @@
               <w:t>≤3 Genkai</w:t>
             </w:r>
           </w:p>
+          <w:p>
+            <w:pPr>
+              <w:spacing w:before="40"/>
+            </w:pPr>
+            <w:r>
+              <w:rPr>
+                <w:b/>
+                <w:i w:val="0"/>
+                <w:color w:val="1A1A2E"/>
+                <w:sz w:val="22"/>
+              </w:rPr>
+              <w:t xml:space="preserve">Soroban: ________ </w:t>
+            </w:r>
+            <w:r>
+              <w:rPr>
+                <w:b w:val="0"/>
+                <w:i/>
+                <w:color w:val="787878"/>
+                <w:sz w:val="16"/>
+              </w:rPr>
+              <w:t>parte da 5 (0-9); +1 su 3, +2 su 2, -1 su 11, -2 su 12; decide il recupero notturno</w:t>
+            </w:r>
+          </w:p>
         </w:tc>
         <w:tc>
           <w:tcPr>
@@ -1615,7 +1638,7 @@
           <w:color w:val="787878"/>
           <w:sz w:val="18"/>
         </w:rPr>
-        <w:t>Il Gou funziona SEMPRE. Successo = preciso, Fallimento = vago. Secondo uso: costo doppio.</w:t>
+        <w:t>Il Gou funziona SEMPRE. Successo = preciso, Fallimento = vago. Ogni uso raddoppia il costo del successivo; una notte di sonno lo riabbassa di un grado.</w:t>
       </w:r>
     </w:p>
     <w:p>

</xml_diff>

<commit_message>
vault backup: 2026-07-07 19:44:36
</commit_message>
<xml_diff>
--- a/Investigare/pg/ANTEPRIMA_Fujita_Emi.docx
+++ b/Investigare/pg/ANTEPRIMA_Fujita_Emi.docx
@@ -864,7 +864,7 @@
                 <w:color w:val="1A1A2E"/>
                 <w:sz w:val="24"/>
               </w:rPr>
-              <w:t>6</w:t>
+              <w:t>5</w:t>
             </w:r>
           </w:p>
         </w:tc>
@@ -1202,7 +1202,7 @@
           <w:color w:val="787878"/>
           <w:sz w:val="18"/>
         </w:rPr>
-        <w:t xml:space="preserve">5 punti da distribuire </w:t>
+        <w:t xml:space="preserve">3 punti da distribuire </w:t>
       </w:r>
       <w:r>
         <w:rPr>
@@ -1211,7 +1211,7 @@
           <w:color w:val="787878"/>
           <w:sz w:val="18"/>
         </w:rPr>
-        <w:t>(max 2 per attributo) + 2d6 prendi il dado più basso come bonus — max 8</w:t>
+        <w:t>(max 2 per attributo, max 8)</w:t>
       </w:r>
     </w:p>
     <w:p>
@@ -2053,6 +2053,460 @@
           <w:sz w:val="18"/>
         </w:rPr>
         <w:t>Capisci che qualcosa non va, ma non riesci a definirlo con precisione</w:t>
+      </w:r>
+    </w:p>
+    <w:p>
+      <w:pPr>
+        <w:spacing w:before="120" w:after="120"/>
+        <w:jc w:val="center"/>
+      </w:pPr>
+      <w:r>
+        <w:rPr>
+          <w:b w:val="0"/>
+          <w:i w:val="0"/>
+          <w:color w:val="B49650"/>
+          <w:sz w:val="12"/>
+        </w:rPr>
+        <w:t>━━━━━━━━━━━━━━━━━━━━━━━━━━━━━━━━━━━━━━━━━━━━━━━━━━━━━━━━━━━━━━━━━━━━━━</w:t>
+      </w:r>
+    </w:p>
+    <w:p>
+      <w:pPr>
+        <w:spacing w:before="160" w:after="80"/>
+      </w:pPr>
+      <w:r>
+        <w:rPr>
+          <w:b w:val="0"/>
+          <w:i w:val="0"/>
+          <w:color w:val="B49650"/>
+          <w:sz w:val="26"/>
+        </w:rPr>
+        <w:t>専門</w:t>
+      </w:r>
+      <w:r>
+        <w:rPr>
+          <w:b w:val="0"/>
+          <w:i w:val="0"/>
+          <w:color w:val="1A1A2E"/>
+          <w:sz w:val="26"/>
+        </w:rPr>
+        <w:t xml:space="preserve">  </w:t>
+      </w:r>
+      <w:r>
+        <w:rPr>
+          <w:b/>
+          <w:i w:val="0"/>
+          <w:color w:val="1A1A2E"/>
+          <w:sz w:val="22"/>
+        </w:rPr>
+        <w:t>SENMON — SPECIALIZZAZIONI  (scegli una, grado 1)</w:t>
+      </w:r>
+    </w:p>
+    <w:p>
+      <w:pPr>
+        <w:spacing w:after="40"/>
+        <w:ind w:left="170"/>
+      </w:pPr>
+      <w:r>
+        <w:rPr>
+          <w:b w:val="0"/>
+          <w:i/>
+          <w:color w:val="787878"/>
+          <w:sz w:val="18"/>
+        </w:rPr>
+        <w:t>Parti da Praticante: +1 ai tiri pertinenti, conosci le cose comuni del campo senza tiro. Cresce con gli usi e i punti Shugyō — vedi GENKAI_Specializzazioni.md.</w:t>
+      </w:r>
+    </w:p>
+    <w:p>
+      <w:pPr>
+        <w:spacing w:after="40"/>
+        <w:ind w:left="170"/>
+      </w:pPr>
+      <w:r>
+        <w:rPr>
+          <w:b w:val="0"/>
+          <w:i w:val="0"/>
+          <w:color w:val="1A1A2E"/>
+          <w:sz w:val="20"/>
+        </w:rPr>
+        <w:t xml:space="preserve">☐ </w:t>
+      </w:r>
+      <w:r>
+        <w:rPr>
+          <w:b/>
+          <w:i w:val="0"/>
+          <w:color w:val="1A1A2E"/>
+          <w:sz w:val="20"/>
+        </w:rPr>
+        <w:t>Copertura e travestimento</w:t>
+      </w:r>
+      <w:r>
+        <w:rPr>
+          <w:b w:val="0"/>
+          <w:i w:val="0"/>
+          <w:color w:val="B49650"/>
+          <w:sz w:val="18"/>
+        </w:rPr>
+        <w:t xml:space="preserve">  (Silenzio)  —  </w:t>
+      </w:r>
+      <w:r>
+        <w:rPr>
+          <w:b w:val="0"/>
+          <w:i w:val="0"/>
+          <w:color w:val="787878"/>
+          <w:sz w:val="18"/>
+        </w:rPr>
+        <w:t>Reggere un ruolo è psicologia applicata: postura, voce, storia di copertura.</w:t>
+      </w:r>
+    </w:p>
+    <w:p>
+      <w:pPr>
+        <w:spacing w:after="40"/>
+        <w:ind w:left="170"/>
+      </w:pPr>
+      <w:r>
+        <w:rPr>
+          <w:b w:val="0"/>
+          <w:i w:val="0"/>
+          <w:color w:val="1A1A2E"/>
+          <w:sz w:val="20"/>
+        </w:rPr>
+        <w:t xml:space="preserve">☐ </w:t>
+      </w:r>
+      <w:r>
+        <w:rPr>
+          <w:b/>
+          <w:i w:val="0"/>
+          <w:color w:val="1A1A2E"/>
+          <w:sz w:val="20"/>
+        </w:rPr>
+        <w:t>Mondo della notte</w:t>
+      </w:r>
+      <w:r>
+        <w:rPr>
+          <w:b w:val="0"/>
+          <w:i w:val="0"/>
+          <w:color w:val="B49650"/>
+          <w:sz w:val="18"/>
+        </w:rPr>
+        <w:t xml:space="preserve">  (Presenza)  —  </w:t>
+      </w:r>
+      <w:r>
+        <w:rPr>
+          <w:b w:val="0"/>
+          <w:i w:val="0"/>
+          <w:color w:val="787878"/>
+          <w:sz w:val="18"/>
+        </w:rPr>
+        <w:t>Bar, hostess club, mizu shōbai: i posti dove le maschere cadono. Sai chi tiene i conti e chi i segreti.</w:t>
+      </w:r>
+    </w:p>
+    <w:p>
+      <w:pPr>
+        <w:spacing w:after="40"/>
+        <w:ind w:left="170"/>
+      </w:pPr>
+      <w:r>
+        <w:rPr>
+          <w:b w:val="0"/>
+          <w:i w:val="0"/>
+          <w:color w:val="1A1A2E"/>
+          <w:sz w:val="20"/>
+        </w:rPr>
+        <w:t xml:space="preserve">☐ </w:t>
+      </w:r>
+      <w:r>
+        <w:rPr>
+          <w:b/>
+          <w:i w:val="0"/>
+          <w:color w:val="1A1A2E"/>
+          <w:sz w:val="20"/>
+        </w:rPr>
+        <w:t>Arte e antiquariato</w:t>
+      </w:r>
+      <w:r>
+        <w:rPr>
+          <w:b w:val="0"/>
+          <w:i w:val="0"/>
+          <w:color w:val="B49650"/>
+          <w:sz w:val="18"/>
+        </w:rPr>
+        <w:t xml:space="preserve">  (Lucidità)  —  </w:t>
+      </w:r>
+      <w:r>
+        <w:rPr>
+          <w:b w:val="0"/>
+          <w:i w:val="0"/>
+          <w:color w:val="787878"/>
+          <w:sz w:val="18"/>
+        </w:rPr>
+        <w:t>Epoche, autori, falsi. La tua estetica coltivata — e il mercato, legale e non, che ci gira attorno.</w:t>
+      </w:r>
+    </w:p>
+    <w:p>
+      <w:pPr>
+        <w:spacing w:before="80" w:after="20"/>
+        <w:ind w:left="170"/>
+      </w:pPr>
+      <w:r>
+        <w:rPr>
+          <w:b/>
+          <w:i w:val="0"/>
+          <w:color w:val="1A1A2E"/>
+          <w:sz w:val="20"/>
+        </w:rPr>
+        <w:t xml:space="preserve">Grado: ______    Usi: </w:t>
+      </w:r>
+      <w:r>
+        <w:rPr>
+          <w:b w:val="0"/>
+          <w:i w:val="0"/>
+          <w:color w:val="1A1A2E"/>
+          <w:sz w:val="22"/>
+        </w:rPr>
+        <w:t>☐☐☐☐☐☐☐☐☐☐</w:t>
+      </w:r>
+    </w:p>
+    <w:p>
+      <w:pPr>
+        <w:ind w:left="170"/>
+      </w:pPr>
+      <w:r>
+        <w:rPr>
+          <w:b w:val="0"/>
+          <w:i/>
+          <w:color w:val="787878"/>
+          <w:sz w:val="16"/>
+        </w:rPr>
+        <w:t>10 usi + 19 Shugyō (attr. chiave di scheda 6+) → Esperto (+2)  ·  25 usi + 39 Shugyō (paletti) → Maestro</w:t>
+      </w:r>
+    </w:p>
+    <w:p>
+      <w:pPr>
+        <w:spacing w:before="120" w:after="120"/>
+        <w:jc w:val="center"/>
+      </w:pPr>
+      <w:r>
+        <w:rPr>
+          <w:b w:val="0"/>
+          <w:i w:val="0"/>
+          <w:color w:val="B49650"/>
+          <w:sz w:val="12"/>
+        </w:rPr>
+        <w:t>━━━━━━━━━━━━━━━━━━━━━━━━━━━━━━━━━━━━━━━━━━━━━━━━━━━━━━━━━━━━━━━━━━━━━━</w:t>
+      </w:r>
+    </w:p>
+    <w:p>
+      <w:pPr>
+        <w:spacing w:before="160" w:after="80"/>
+      </w:pPr>
+      <w:r>
+        <w:rPr>
+          <w:b w:val="0"/>
+          <w:i w:val="0"/>
+          <w:color w:val="B49650"/>
+          <w:sz w:val="26"/>
+        </w:rPr>
+        <w:t>装</w:t>
+      </w:r>
+      <w:r>
+        <w:rPr>
+          <w:b w:val="0"/>
+          <w:i w:val="0"/>
+          <w:color w:val="1A1A2E"/>
+          <w:sz w:val="26"/>
+        </w:rPr>
+        <w:t xml:space="preserve">  </w:t>
+      </w:r>
+      <w:r>
+        <w:rPr>
+          <w:b/>
+          <w:i w:val="0"/>
+          <w:color w:val="1A1A2E"/>
+          <w:sz w:val="22"/>
+        </w:rPr>
+        <w:t>EQUIPAGGIAMENTO DI SERVIZIO</w:t>
+      </w:r>
+    </w:p>
+    <w:p>
+      <w:pPr>
+        <w:spacing w:after="40"/>
+        <w:ind w:left="170"/>
+      </w:pPr>
+      <w:r>
+        <w:rPr>
+          <w:b w:val="0"/>
+          <w:i/>
+          <w:color w:val="787878"/>
+          <w:sz w:val="18"/>
+        </w:rPr>
+        <w:t>In borghese non porti l'arma: resta nell'armadietto in centrale e si preleva, firmando, solo per le operazioni. (Regole di scontro: GENKAI_Combattimento.md)</w:t>
+      </w:r>
+    </w:p>
+    <w:p>
+      <w:pPr>
+        <w:spacing w:after="20"/>
+        <w:ind w:left="170"/>
+      </w:pPr>
+      <w:r>
+        <w:rPr>
+          <w:b w:val="0"/>
+          <w:i w:val="0"/>
+          <w:color w:val="787878"/>
+          <w:sz w:val="18"/>
+        </w:rPr>
+        <w:t>• Armadietto — Revolver New Nambu M60 (.38, 5 colpi): Lucidità, danno +3. Addestramento base: sai usarla, non sei un tiratore scelto</w:t>
+      </w:r>
+    </w:p>
+    <w:p>
+      <w:pPr>
+        <w:spacing w:after="20"/>
+        <w:ind w:left="170"/>
+      </w:pPr>
+      <w:r>
+        <w:rPr>
+          <w:b w:val="0"/>
+          <w:i w:val="0"/>
+          <w:color w:val="787878"/>
+          <w:sz w:val="18"/>
+        </w:rPr>
+        <w:t>• Armadietto — Giubbotto antiproiettile: -2 al dado di difesa contro armi da fuoco (operazioni a rischio)</w:t>
+      </w:r>
+    </w:p>
+    <w:p>
+      <w:pPr>
+        <w:spacing w:after="20"/>
+        <w:ind w:left="170"/>
+      </w:pPr>
+      <w:r>
+        <w:rPr>
+          <w:b w:val="0"/>
+          <w:i w:val="0"/>
+          <w:color w:val="787878"/>
+          <w:sz w:val="18"/>
+        </w:rPr>
+        <w:t>• Operazioni — Keibō (manganello): Silenzio, danno +2</w:t>
+      </w:r>
+    </w:p>
+    <w:p>
+      <w:pPr>
+        <w:spacing w:after="20"/>
+        <w:ind w:left="170"/>
+      </w:pPr>
+      <w:r>
+        <w:rPr>
+          <w:b w:val="0"/>
+          <w:i w:val="0"/>
+          <w:color w:val="787878"/>
+          <w:sz w:val="18"/>
+        </w:rPr>
+        <w:t>• Sempre con te — Keisatsu techō (tesserino), manette, taccuino</w:t>
+      </w:r>
+    </w:p>
+    <w:p>
+      <w:pPr>
+        <w:spacing w:after="20"/>
+        <w:ind w:left="170"/>
+      </w:pPr>
+      <w:r>
+        <w:rPr>
+          <w:b w:val="0"/>
+          <w:i w:val="0"/>
+          <w:color w:val="787878"/>
+          <w:sz w:val="18"/>
+        </w:rPr>
+        <w:t>• A mani nude — Lotta: Presenza, danno +1 (prese e immobilizzazioni d'accademia)</w:t>
+      </w:r>
+    </w:p>
+    <w:p>
+      <w:pPr>
+        <w:spacing w:before="120" w:after="120"/>
+        <w:jc w:val="center"/>
+      </w:pPr>
+      <w:r>
+        <w:rPr>
+          <w:b w:val="0"/>
+          <w:i w:val="0"/>
+          <w:color w:val="B49650"/>
+          <w:sz w:val="12"/>
+        </w:rPr>
+        <w:t>━━━━━━━━━━━━━━━━━━━━━━━━━━━━━━━━━━━━━━━━━━━━━━━━━━━━━━━━━━━━━━━━━━━━━━</w:t>
+      </w:r>
+    </w:p>
+    <w:p>
+      <w:pPr>
+        <w:spacing w:before="160" w:after="80"/>
+      </w:pPr>
+      <w:r>
+        <w:rPr>
+          <w:b w:val="0"/>
+          <w:i w:val="0"/>
+          <w:color w:val="B49650"/>
+          <w:sz w:val="26"/>
+        </w:rPr>
+        <w:t>修行</w:t>
+      </w:r>
+      <w:r>
+        <w:rPr>
+          <w:b w:val="0"/>
+          <w:i w:val="0"/>
+          <w:color w:val="1A1A2E"/>
+          <w:sz w:val="26"/>
+        </w:rPr>
+        <w:t xml:space="preserve">  </w:t>
+      </w:r>
+      <w:r>
+        <w:rPr>
+          <w:b/>
+          <w:i w:val="0"/>
+          <w:color w:val="1A1A2E"/>
+          <w:sz w:val="22"/>
+        </w:rPr>
+        <w:t>SHUGYŌ — CRESCITA</w:t>
+      </w:r>
+    </w:p>
+    <w:p>
+      <w:pPr>
+        <w:spacing w:after="40"/>
+        <w:ind w:left="170"/>
+      </w:pPr>
+      <w:r>
+        <w:rPr>
+          <w:b/>
+          <w:i w:val="0"/>
+          <w:color w:val="1A1A2E"/>
+          <w:sz w:val="22"/>
+        </w:rPr>
+        <w:t>Punti Shugyō: ____________________</w:t>
+      </w:r>
+    </w:p>
+    <w:p>
+      <w:pPr>
+        <w:spacing w:after="20"/>
+        <w:ind w:left="170"/>
+      </w:pPr>
+      <w:r>
+        <w:rPr>
+          <w:b w:val="0"/>
+          <w:i w:val="0"/>
+          <w:color w:val="787878"/>
+          <w:sz w:val="16"/>
+        </w:rPr>
+        <w:t>Guadagno: 1 a sessione · 4-6 a caso chiuso · +1 scena personale ben gestita · +1 momento eccezionale (max 1/sessione)</w:t>
+      </w:r>
+    </w:p>
+    <w:p>
+      <w:pPr>
+        <w:ind w:left="170"/>
+      </w:pPr>
+      <w:r>
+        <w:rPr>
+          <w:b w:val="0"/>
+          <w:i w:val="0"/>
+          <w:color w:val="787878"/>
+          <w:sz w:val="16"/>
+        </w:rPr>
+        <w:t>Spesa tra i casi: attributo = arrivo ×3 · Ki max = arrivo ×4 (tetto 12) · Senmon 9/19/39 · Enja extra 12 · affinare il Gou = base ×11</w:t>
       </w:r>
     </w:p>
     <w:p>

</xml_diff>

<commit_message>
vault backup: 2026-07-14 13:22:42
</commit_message>
<xml_diff>
--- a/Investigare/pg/ANTEPRIMA_Fujita_Emi.docx
+++ b/Investigare/pg/ANTEPRIMA_Fujita_Emi.docx
@@ -1294,7 +1294,7 @@
                 <w:color w:val="8B0000"/>
                 <w:sz w:val="16"/>
               </w:rPr>
-              <w:t>attributo più basso +2d6 prendi il dado più alto, 1 si ritira</w:t>
+              <w:t>attributo più basso + 2d6 prendi il più alto; l'1 si ritira una sola volta. Il dado si ritira a ogni nuovo caso; i comprati si sommano sempre</w:t>
             </w:r>
           </w:p>
           <w:p>
@@ -1337,7 +1337,7 @@
                 <w:color w:val="787878"/>
                 <w:sz w:val="16"/>
               </w:rPr>
-              <w:t>parte da 5 (0-9); +1 su 3, +2 su 2, -1 su 11, -2 su 12; decide il recupero notturno</w:t>
+              <w:t>parte da 5 (0-9); +1 su 3, +2 su 2, -1 su 11, -2 su 12; decide il recupero notturno; domani riparti dalla chiusura, avvicinata di 1 al riposo</w:t>
             </w:r>
           </w:p>
         </w:tc>
@@ -1386,7 +1386,7 @@
                 <w:color w:val="787878"/>
                 <w:sz w:val="18"/>
               </w:rPr>
-              <w:t>1/sessione</w:t>
+              <w:t>1/sessione — dichiarato prima del tiro</w:t>
             </w:r>
           </w:p>
           <w:p>
@@ -1397,7 +1397,7 @@
                 <w:color w:val="1A1A2E"/>
                 <w:sz w:val="18"/>
               </w:rPr>
-              <w:t>successo automatico ☐</w:t>
+              <w:t>il dado vale 2, niente Kiwami ☐</w:t>
             </w:r>
           </w:p>
         </w:tc>
@@ -1638,7 +1638,7 @@
           <w:color w:val="787878"/>
           <w:sz w:val="18"/>
         </w:rPr>
-        <w:t>Il Gou funziona SEMPRE. Successo = preciso, Fallimento = vago. Ogni uso raddoppia il costo del successivo; una notte di sonno lo riabbassa di un grado.</w:t>
+        <w:t>Il Gou funziona SEMPRE. Successo = preciso, Fallimento = vago. Ogni uso raddoppia il costo del successivo; una notte di sonno lo riabbassa di un grado. Il costo si paga per intero: se ti porterebbe a 0 o sotto, il Gou non si attiva.</w:t>
       </w:r>
     </w:p>
     <w:p>
@@ -2355,7 +2355,7 @@
           <w:color w:val="787878"/>
           <w:sz w:val="18"/>
         </w:rPr>
-        <w:t>• Armadietto — Revolver New Nambu M60 (.38, 5 colpi): Lucidità, danno +3. Addestramento base: sai usarla, non sei un tiratore scelto</w:t>
+        <w:t>• Armadietto — Revolver New Nambu M60 (.38, 5 colpi): Lucidità · vel. 3/1 · ricarica 4 · danno 3. Addestramento base: sai usarla, non sei un tiratore scelto</w:t>
       </w:r>
     </w:p>
     <w:p>
@@ -2370,7 +2370,7 @@
           <w:color w:val="787878"/>
           <w:sz w:val="18"/>
         </w:rPr>
-        <w:t>• Armadietto — Giubbotto antiproiettile: -2 al dado di difesa contro armi da fuoco (operazioni a rischio)</w:t>
+        <w:t>• Armadietto — Giubbotto antiproiettile: Assorbe 3 (fisso, contro ogni colpo) · indossare 4</w:t>
       </w:r>
     </w:p>
     <w:p>
@@ -2385,7 +2385,7 @@
           <w:color w:val="787878"/>
           <w:sz w:val="18"/>
         </w:rPr>
-        <w:t>• Operazioni — Keibō (manganello): Silenzio, danno +2</w:t>
+        <w:t>• Operazioni — Keibō (manganello): Pazienza o Silenzio · vel. 2/1 · danno 2</w:t>
       </w:r>
     </w:p>
     <w:p>
@@ -2415,7 +2415,7 @@
           <w:color w:val="787878"/>
           <w:sz w:val="18"/>
         </w:rPr>
-        <w:t>• A mani nude — Lotta: Presenza, danno +1 (prese e immobilizzazioni d'accademia)</w:t>
+        <w:t>• A mani nude — Lotta 1 d'accademia: Presenza · vel. 1/1 · danno 1 (prese e immobilizzazioni; il grado 1 ce l'hanno tutti gli investigatori)</w:t>
       </w:r>
     </w:p>
     <w:p>

</xml_diff>

<commit_message>
vault backup: 2026-07-28 06:52:29
</commit_message>
<xml_diff>
--- a/Investigare/pg/ANTEPRIMA_Fujita_Emi.docx
+++ b/Investigare/pg/ANTEPRIMA_Fujita_Emi.docx
@@ -31,7 +31,7 @@
       <w:tr>
         <w:tc>
           <w:tcPr>
-            <w:tcW w:w="4536" w:type="dxa"/>
+            <w:tcW w:w="4082" w:type="dxa"/>
             <w:vAlign w:val="center"/>
             <w:tcBorders>
               <w:top w:val="none"/>
@@ -72,7 +72,7 @@
         </w:tc>
         <w:tc>
           <w:tcPr>
-            <w:tcW w:w="5103" w:type="dxa"/>
+            <w:tcW w:w="4649" w:type="dxa"/>
             <w:vAlign w:val="center"/>
             <w:tcBorders>
               <w:top w:val="none"/>
@@ -176,7 +176,7 @@
         </w:tc>
         <w:tc>
           <w:tcPr>
-            <w:tcW w:w="2268" w:type="dxa"/>
+            <w:tcW w:w="2041" w:type="dxa"/>
             <w:vAlign w:val="center"/>
             <w:tcBorders>
               <w:top w:val="none"/>
@@ -229,7 +229,7 @@
     </w:tbl>
     <w:p>
       <w:pPr>
-        <w:spacing w:before="120" w:after="120"/>
+        <w:spacing w:before="80" w:after="80"/>
         <w:jc w:val="center"/>
       </w:pPr>
       <w:r>
@@ -244,6 +244,7 @@
     </w:p>
     <w:p>
       <w:pPr>
+        <w:keepNext/>
         <w:spacing w:before="160" w:after="80"/>
       </w:pPr>
       <w:r>
@@ -1216,7 +1217,7 @@
     </w:p>
     <w:p>
       <w:pPr>
-        <w:spacing w:before="120" w:after="120"/>
+        <w:spacing w:before="80" w:after="80"/>
         <w:jc w:val="center"/>
       </w:pPr>
       <w:r>
@@ -1405,7 +1406,7 @@
     </w:tbl>
     <w:p>
       <w:pPr>
-        <w:spacing w:before="120" w:after="120"/>
+        <w:spacing w:before="80" w:after="80"/>
         <w:jc w:val="center"/>
       </w:pPr>
       <w:r>
@@ -1581,7 +1582,7 @@
     </w:tbl>
     <w:p>
       <w:pPr>
-        <w:spacing w:before="120" w:after="120"/>
+        <w:spacing w:before="80" w:after="80"/>
         <w:jc w:val="center"/>
       </w:pPr>
       <w:r>
@@ -1596,6 +1597,7 @@
     </w:p>
     <w:p>
       <w:pPr>
+        <w:keepNext/>
         <w:spacing w:before="160" w:after="80"/>
       </w:pPr>
       <w:r>
@@ -1628,6 +1630,8 @@
     </w:p>
     <w:p>
       <w:pPr>
+        <w:keepNext/>
+        <w:keepLines/>
         <w:spacing w:after="40"/>
         <w:ind w:left="170"/>
       </w:pPr>
@@ -1638,11 +1642,13 @@
           <w:color w:val="787878"/>
           <w:sz w:val="18"/>
         </w:rPr>
-        <w:t>Il Gou funziona SEMPRE. Successo = preciso, Fallimento = vago. Ogni uso raddoppia il costo del successivo; una notte di sonno lo riabbassa di un grado. Il costo si paga per intero: se ti porterebbe a 0 o sotto, il Gou non si attiva.</w:t>
+        <w:t>Il Gou funziona SEMPRE. Successo = preciso, Fallimento = vago. Ogni uso raddoppia il costo del successivo; una notte di sonno lo riabbassa di un grado. Il costo si paga per intero: se ti portasse a 0 o sotto, il Gou non si attiva.</w:t>
       </w:r>
     </w:p>
     <w:p>
       <w:pPr>
+        <w:keepNext/>
+        <w:keepLines/>
         <w:spacing w:before="120" w:after="40"/>
         <w:ind w:left="170"/>
       </w:pPr>
@@ -1667,6 +1673,8 @@
     </w:p>
     <w:p>
       <w:pPr>
+        <w:keepNext/>
+        <w:keepLines/>
         <w:spacing w:after="40"/>
         <w:ind w:left="340"/>
       </w:pPr>
@@ -1682,6 +1690,8 @@
     </w:p>
     <w:p>
       <w:pPr>
+        <w:keepNext/>
+        <w:keepLines/>
         <w:spacing w:after="20"/>
         <w:ind w:left="340"/>
       </w:pPr>
@@ -1733,6 +1743,8 @@
     </w:p>
     <w:p>
       <w:pPr>
+        <w:keepNext/>
+        <w:keepLines/>
         <w:spacing w:after="20"/>
         <w:ind w:left="340"/>
       </w:pPr>
@@ -1757,6 +1769,7 @@
     </w:p>
     <w:p>
       <w:pPr>
+        <w:keepLines/>
         <w:spacing w:after="40"/>
         <w:ind w:left="340"/>
       </w:pPr>
@@ -1781,6 +1794,8 @@
     </w:p>
     <w:p>
       <w:pPr>
+        <w:keepNext/>
+        <w:keepLines/>
         <w:spacing w:before="120" w:after="40"/>
         <w:ind w:left="170"/>
       </w:pPr>
@@ -1805,6 +1820,8 @@
     </w:p>
     <w:p>
       <w:pPr>
+        <w:keepNext/>
+        <w:keepLines/>
         <w:spacing w:after="40"/>
         <w:ind w:left="340"/>
       </w:pPr>
@@ -1820,6 +1837,8 @@
     </w:p>
     <w:p>
       <w:pPr>
+        <w:keepNext/>
+        <w:keepLines/>
         <w:spacing w:after="20"/>
         <w:ind w:left="340"/>
       </w:pPr>
@@ -1871,6 +1890,34 @@
     </w:p>
     <w:p>
       <w:pPr>
+        <w:keepNext/>
+        <w:keepLines/>
+        <w:spacing w:after="20"/>
+        <w:ind w:left="340"/>
+      </w:pPr>
+      <w:r>
+        <w:rPr>
+          <w:b/>
+          <w:i w:val="0"/>
+          <w:color w:val="787878"/>
+          <w:sz w:val="18"/>
+        </w:rPr>
+        <w:t xml:space="preserve">Vincolo: </w:t>
+      </w:r>
+      <w:r>
+        <w:rPr>
+          <w:b w:val="0"/>
+          <w:i w:val="0"/>
+          <w:color w:val="787878"/>
+          <w:sz w:val="18"/>
+        </w:rPr>
+        <w:t>devi essere sul luogo, entro 48 ore dal fatto</w:t>
+      </w:r>
+    </w:p>
+    <w:p>
+      <w:pPr>
+        <w:keepNext/>
+        <w:keepLines/>
         <w:spacing w:after="20"/>
         <w:ind w:left="340"/>
       </w:pPr>
@@ -1895,6 +1942,7 @@
     </w:p>
     <w:p>
       <w:pPr>
+        <w:keepLines/>
         <w:spacing w:after="40"/>
         <w:ind w:left="340"/>
       </w:pPr>
@@ -1919,6 +1967,8 @@
     </w:p>
     <w:p>
       <w:pPr>
+        <w:keepNext/>
+        <w:keepLines/>
         <w:spacing w:before="120" w:after="40"/>
         <w:ind w:left="170"/>
       </w:pPr>
@@ -1943,6 +1993,8 @@
     </w:p>
     <w:p>
       <w:pPr>
+        <w:keepNext/>
+        <w:keepLines/>
         <w:spacing w:after="40"/>
         <w:ind w:left="340"/>
       </w:pPr>
@@ -1958,6 +2010,8 @@
     </w:p>
     <w:p>
       <w:pPr>
+        <w:keepNext/>
+        <w:keepLines/>
         <w:spacing w:after="20"/>
         <w:ind w:left="340"/>
       </w:pPr>
@@ -2009,6 +2063,8 @@
     </w:p>
     <w:p>
       <w:pPr>
+        <w:keepNext/>
+        <w:keepLines/>
         <w:spacing w:after="20"/>
         <w:ind w:left="340"/>
       </w:pPr>
@@ -2033,6 +2089,7 @@
     </w:p>
     <w:p>
       <w:pPr>
+        <w:keepLines/>
         <w:spacing w:after="40"/>
         <w:ind w:left="340"/>
       </w:pPr>
@@ -2057,7 +2114,7 @@
     </w:p>
     <w:p>
       <w:pPr>
-        <w:spacing w:before="120" w:after="120"/>
+        <w:spacing w:before="80" w:after="80"/>
         <w:jc w:val="center"/>
       </w:pPr>
       <w:r>
@@ -2072,6 +2129,7 @@
     </w:p>
     <w:p>
       <w:pPr>
+        <w:keepNext/>
         <w:spacing w:before="160" w:after="80"/>
       </w:pPr>
       <w:r>
@@ -2104,6 +2162,8 @@
     </w:p>
     <w:p>
       <w:pPr>
+        <w:keepNext/>
+        <w:keepLines/>
         <w:spacing w:after="40"/>
         <w:ind w:left="170"/>
       </w:pPr>
@@ -2114,11 +2174,13 @@
           <w:color w:val="787878"/>
           <w:sz w:val="18"/>
         </w:rPr>
-        <w:t>Parti da Praticante: +1 ai tiri pertinenti, conosci le cose comuni del campo senza tiro. Cresce con gli usi e i punti Shugyō — vedi GENKAI_Specializzazioni.md.</w:t>
+        <w:t>Parti da Praticante: +1 ai tiri pertinenti (il bonus si sottrae dal dado), conosci le cose comuni del campo senza tiro. Cresce con gli usi e i punti Shugyō — vedi GENKAI_Specializzazioni.md.</w:t>
       </w:r>
     </w:p>
     <w:p>
       <w:pPr>
+        <w:keepNext/>
+        <w:keepLines/>
         <w:spacing w:after="40"/>
         <w:ind w:left="170"/>
       </w:pPr>
@@ -2161,6 +2223,8 @@
     </w:p>
     <w:p>
       <w:pPr>
+        <w:keepNext/>
+        <w:keepLines/>
         <w:spacing w:after="40"/>
         <w:ind w:left="170"/>
       </w:pPr>
@@ -2203,6 +2267,8 @@
     </w:p>
     <w:p>
       <w:pPr>
+        <w:keepNext/>
+        <w:keepLines/>
         <w:spacing w:after="40"/>
         <w:ind w:left="170"/>
       </w:pPr>
@@ -2245,6 +2311,7 @@
     </w:p>
     <w:p>
       <w:pPr>
+        <w:keepNext/>
         <w:spacing w:before="80" w:after="20"/>
         <w:ind w:left="170"/>
       </w:pPr>
@@ -2283,7 +2350,7 @@
     </w:p>
     <w:p>
       <w:pPr>
-        <w:spacing w:before="120" w:after="120"/>
+        <w:spacing w:before="80" w:after="80"/>
         <w:jc w:val="center"/>
       </w:pPr>
       <w:r>
@@ -2298,6 +2365,7 @@
     </w:p>
     <w:p>
       <w:pPr>
+        <w:keepNext/>
         <w:spacing w:before="160" w:after="80"/>
       </w:pPr>
       <w:r>
@@ -2330,6 +2398,8 @@
     </w:p>
     <w:p>
       <w:pPr>
+        <w:keepNext/>
+        <w:keepLines/>
         <w:spacing w:after="40"/>
         <w:ind w:left="170"/>
       </w:pPr>
@@ -2345,6 +2415,8 @@
     </w:p>
     <w:p>
       <w:pPr>
+        <w:keepNext/>
+        <w:keepLines/>
         <w:spacing w:after="20"/>
         <w:ind w:left="170"/>
       </w:pPr>
@@ -2355,11 +2427,13 @@
           <w:color w:val="787878"/>
           <w:sz w:val="18"/>
         </w:rPr>
-        <w:t>• Armadietto — Revolver New Nambu M60 (.38, 5 colpi): Lucidità · vel. 3/1 · ricarica 4 · danno 3. Addestramento base: sai usarla, non sei un tiratore scelto</w:t>
+        <w:t>• Armadietto — Revolver New Nambu M60 (.38, 5 colpi): Lucidità · vel. 3/1 · ricarica 4 · danno 3. Addestramento base: sai usarla, non sei una tiratrice scelta</w:t>
       </w:r>
     </w:p>
     <w:p>
       <w:pPr>
+        <w:keepNext/>
+        <w:keepLines/>
         <w:spacing w:after="20"/>
         <w:ind w:left="170"/>
       </w:pPr>
@@ -2375,6 +2449,8 @@
     </w:p>
     <w:p>
       <w:pPr>
+        <w:keepNext/>
+        <w:keepLines/>
         <w:spacing w:after="20"/>
         <w:ind w:left="170"/>
       </w:pPr>
@@ -2385,11 +2461,13 @@
           <w:color w:val="787878"/>
           <w:sz w:val="18"/>
         </w:rPr>
-        <w:t>• Operazioni — Keibō (manganello): Pazienza o Silenzio · vel. 2/1 · danno 2</w:t>
+        <w:t>• Operazioni — Keibō (manganello): Silenzio · vel. 2/1 · danno 2</w:t>
       </w:r>
     </w:p>
     <w:p>
       <w:pPr>
+        <w:keepNext/>
+        <w:keepLines/>
         <w:spacing w:after="20"/>
         <w:ind w:left="170"/>
       </w:pPr>
@@ -2405,6 +2483,7 @@
     </w:p>
     <w:p>
       <w:pPr>
+        <w:keepLines/>
         <w:spacing w:after="20"/>
         <w:ind w:left="170"/>
       </w:pPr>
@@ -2420,7 +2499,7 @@
     </w:p>
     <w:p>
       <w:pPr>
-        <w:spacing w:before="120" w:after="120"/>
+        <w:spacing w:before="80" w:after="80"/>
         <w:jc w:val="center"/>
       </w:pPr>
       <w:r>
@@ -2435,6 +2514,7 @@
     </w:p>
     <w:p>
       <w:pPr>
+        <w:keepNext/>
         <w:spacing w:before="160" w:after="80"/>
       </w:pPr>
       <w:r>
@@ -2467,6 +2547,7 @@
     </w:p>
     <w:p>
       <w:pPr>
+        <w:keepNext/>
         <w:spacing w:after="40"/>
         <w:ind w:left="170"/>
       </w:pPr>
@@ -2482,6 +2563,7 @@
     </w:p>
     <w:p>
       <w:pPr>
+        <w:keepNext/>
         <w:spacing w:after="20"/>
         <w:ind w:left="170"/>
       </w:pPr>
@@ -2511,7 +2593,7 @@
     </w:p>
     <w:p>
       <w:pPr>
-        <w:spacing w:before="120" w:after="120"/>
+        <w:spacing w:before="80" w:after="80"/>
         <w:jc w:val="center"/>
       </w:pPr>
       <w:r>
@@ -2531,6 +2613,7 @@
     </w:p>
     <w:p>
       <w:pPr>
+        <w:keepNext/>
         <w:spacing w:before="160" w:after="80"/>
       </w:pPr>
       <w:r>
@@ -2563,6 +2646,7 @@
     </w:p>
     <w:p>
       <w:pPr>
+        <w:keepLines/>
         <w:spacing w:after="60"/>
         <w:ind w:left="170"/>
       </w:pPr>
@@ -2578,7 +2662,7 @@
     </w:p>
     <w:p>
       <w:pPr>
-        <w:spacing w:before="120" w:after="120"/>
+        <w:spacing w:before="80" w:after="80"/>
         <w:jc w:val="center"/>
       </w:pPr>
       <w:r>
@@ -2593,6 +2677,7 @@
     </w:p>
     <w:p>
       <w:pPr>
+        <w:keepNext/>
         <w:spacing w:before="160" w:after="80"/>
       </w:pPr>
       <w:r>
@@ -2625,6 +2710,7 @@
     </w:p>
     <w:p>
       <w:pPr>
+        <w:keepLines/>
         <w:spacing w:after="60"/>
         <w:ind w:left="170"/>
       </w:pPr>
@@ -2640,7 +2726,7 @@
     </w:p>
     <w:p>
       <w:pPr>
-        <w:spacing w:before="120" w:after="120"/>
+        <w:spacing w:before="80" w:after="80"/>
         <w:jc w:val="center"/>
       </w:pPr>
       <w:r>
@@ -2655,6 +2741,7 @@
     </w:p>
     <w:p>
       <w:pPr>
+        <w:keepNext/>
         <w:spacing w:before="160" w:after="80"/>
       </w:pPr>
       <w:r>
@@ -2882,6 +2969,7 @@
     </w:tbl>
     <w:p>
       <w:pPr>
+        <w:keepLines/>
         <w:spacing w:after="40"/>
         <w:ind w:left="170"/>
       </w:pPr>
@@ -2897,7 +2985,7 @@
     </w:p>
     <w:p>
       <w:pPr>
-        <w:spacing w:before="120" w:after="120"/>
+        <w:spacing w:before="80" w:after="80"/>
         <w:jc w:val="center"/>
       </w:pPr>
       <w:r>
@@ -2912,6 +3000,7 @@
     </w:p>
     <w:p>
       <w:pPr>
+        <w:keepNext/>
         <w:spacing w:before="160" w:after="80"/>
       </w:pPr>
       <w:r>
@@ -2944,6 +3033,7 @@
     </w:p>
     <w:p>
       <w:pPr>
+        <w:keepLines/>
         <w:spacing w:after="40"/>
         <w:ind w:left="170"/>
       </w:pPr>
@@ -2959,6 +3049,7 @@
     </w:p>
     <w:p>
       <w:pPr>
+        <w:keepLines/>
         <w:spacing w:after="40"/>
         <w:ind w:left="170"/>
       </w:pPr>
@@ -3022,6 +3113,7 @@
     </w:p>
     <w:p>
       <w:pPr>
+        <w:keepLines/>
         <w:spacing w:after="40"/>
         <w:ind w:left="170"/>
       </w:pPr>
@@ -3037,7 +3129,7 @@
     </w:p>
     <w:p>
       <w:pPr>
-        <w:spacing w:before="120" w:after="120"/>
+        <w:spacing w:before="80" w:after="80"/>
         <w:jc w:val="center"/>
       </w:pPr>
       <w:r>
@@ -3052,6 +3144,7 @@
     </w:p>
     <w:p>
       <w:pPr>
+        <w:keepNext/>
         <w:spacing w:before="160" w:after="80"/>
       </w:pPr>
       <w:r>
@@ -3204,7 +3297,7 @@
     </w:p>
     <w:p>
       <w:pPr>
-        <w:spacing w:before="120" w:after="120"/>
+        <w:spacing w:before="80" w:after="80"/>
         <w:jc w:val="center"/>
       </w:pPr>
       <w:r>
@@ -3219,6 +3312,7 @@
     </w:p>
     <w:p>
       <w:pPr>
+        <w:keepNext/>
         <w:spacing w:before="160" w:after="80"/>
       </w:pPr>
       <w:r>
@@ -3270,7 +3364,7 @@
           <w:color w:val="1A1A2E"/>
           <w:sz w:val="20"/>
         </w:rPr>
-        <w:t>Whisky Nikka. Un dito, da sola, la sera dopo i casi pesanti. Non in compagnia.</w:t>
+        <w:t>Whisky Nikka. Un dito, da sola, la sera dopo i casi pesanti. Quasi mai in compagnia — l'eccezione è Morita.</w:t>
       </w:r>
     </w:p>
     <w:p>
@@ -3357,7 +3451,7 @@
           <w:color w:val="787878"/>
           <w:sz w:val="20"/>
         </w:rPr>
-        <w:t xml:space="preserve">Rituale: </w:t>
+        <w:t xml:space="preserve">Rifugio: </w:t>
       </w:r>
       <w:r>
         <w:rPr>
@@ -3371,7 +3465,7 @@
     </w:p>
     <w:p>
       <w:pPr>
-        <w:spacing w:before="120" w:after="120"/>
+        <w:spacing w:before="80" w:after="80"/>
         <w:jc w:val="center"/>
       </w:pPr>
       <w:r>
@@ -3386,6 +3480,7 @@
     </w:p>
     <w:p>
       <w:pPr>
+        <w:keepNext/>
         <w:spacing w:before="160" w:after="80"/>
       </w:pPr>
       <w:r>
@@ -3418,6 +3513,8 @@
     </w:p>
     <w:p>
       <w:pPr>
+        <w:keepNext/>
+        <w:keepLines/>
         <w:spacing w:after="60"/>
         <w:ind w:left="170"/>
       </w:pPr>
@@ -3442,6 +3539,8 @@
     </w:p>
     <w:p>
       <w:pPr>
+        <w:keepNext/>
+        <w:keepLines/>
         <w:spacing w:after="60"/>
         <w:ind w:left="170"/>
       </w:pPr>
@@ -3466,6 +3565,8 @@
     </w:p>
     <w:p>
       <w:pPr>
+        <w:keepNext/>
+        <w:keepLines/>
         <w:spacing w:after="60"/>
         <w:ind w:left="170"/>
       </w:pPr>
@@ -3490,6 +3591,7 @@
     </w:p>
     <w:p>
       <w:pPr>
+        <w:keepLines/>
         <w:spacing w:after="60"/>
         <w:ind w:left="170"/>
       </w:pPr>

</xml_diff>